<commit_message>
fix(docx,html): synchronize downloadable docx and print htmls with screen reader chapters
</commit_message>
<xml_diff>
--- a/landing_transferegov/materiais_complementares/slides/Cartilha_de_Nivelamento_Modulo_de_Gestao_de_Parcerias_e_TRANSFEREGOV.docx
+++ b/landing_transferegov/materiais_complementares/slides/Cartilha_de_Nivelamento_Modulo_de_Gestao_de_Parcerias_e_TRANSFEREGOV.docx
@@ -11,8 +11,8 @@
         <w:rPr>
           <w:rFonts w:ascii="Calibri" w:hAnsi="Calibri"/>
           <w:b/>
-          <w:color w:val="10B981"/>
-          <w:sz w:val="48"/>
+          <w:color w:val="0284C7"/>
+          <w:sz w:val="44"/>
         </w:rPr>
         <w:t>CARTILHA DE NIVELAMENTO</w:t>
       </w:r>
@@ -26,8 +26,8 @@
         <w:rPr>
           <w:rFonts w:ascii="Calibri" w:hAnsi="Calibri"/>
           <w:i/>
-          <w:color w:val="4FACFE"/>
-          <w:sz w:val="26"/>
+          <w:color w:val="0EA5E9"/>
+          <w:sz w:val="24"/>
         </w:rPr>
         <w:t>Módulo de Gestão de Parcerias e Ecossistema TRANSFEREGOV.BR</w:t>
         <w:br/>
@@ -41,7 +41,7 @@
       </w:pPr>
       <w:r>
         <w:rPr>
-          <w:color w:val="DCDCDC"/>
+          <w:color w:val="E2E8F0"/>
         </w:rPr>
         <w:t>____________________________________________________</w:t>
       </w:r>
@@ -49,14 +49,14 @@
     <w:p>
       <w:pPr>
         <w:keepNext/>
-        <w:spacing w:before="360" w:after="160"/>
+        <w:spacing w:before="320" w:after="160"/>
       </w:pPr>
       <w:r>
         <w:rPr>
           <w:rFonts w:ascii="Calibri" w:hAnsi="Calibri"/>
           <w:b/>
-          <w:color w:val="0B111E"/>
-          <w:sz w:val="30"/>
+          <w:color w:val="0F172A"/>
+          <w:sz w:val="28"/>
         </w:rPr>
         <w:t>1. Sumário Executivo</w:t>
       </w:r>
@@ -68,10 +68,10 @@
       <w:r>
         <w:rPr>
           <w:rFonts w:ascii="Calibri" w:hAnsi="Calibri"/>
-          <w:color w:val="3C3C3C"/>
-          <w:sz w:val="22"/>
+          <w:color w:val="334155"/>
+          <w:sz w:val="21"/>
         </w:rPr>
-        <w:t>A modernização dos repasses de recursos na administração pública federal atinge um marco fundamental com a transição para o modelo de Transferência Simplificada no TRANSFEREGOV.BR. Esta mudança é uma resposta direta à necessidade de conferir celeridade e eficiência à execução de políticas públicas de fomento e parcerias. O novo modelo rompe com a rigidez dos convênios tradicionais, adotando uma sistemática baseada em adesão eletrônica, metas padronizadas e monitoramento focado em resultados físicos. Esta cartilha sintetiza as diretrizes estabelecidas pelo Ministério da Gestão e da Inovação em Serviços Públicos (MGI) para servir como guia definitivo na implantação do Módulo de Gestão de Parcerias, aplicando-se de forma ampla a todos os órgãos federais concedentes, estados, municípios e Organizações da Sociedade Civil (OSCs).</w:t>
+        <w:t>A modernização dos repasses de recursos no âmbito federal atinge um marco fundamental com a transição para o modelo de Transferência Simplificada no TRANSFEREGOV. Esta mudança é uma resposta direta à necessidade de conferir celeridade e eficiência à execução de políticas públicas críticas e otimizar as parcerias interfederativas.</w:t>
       </w:r>
     </w:p>
     <w:tbl>
@@ -88,7 +88,150 @@
         <w:tc>
           <w:tcPr>
             <w:tcW w:type="dxa" w:w="8352"/>
-            <w:shd w:val="clear" w:color="auto" w:fill="F2FAF7"/>
+            <w:shd w:val="clear" w:color="auto" w:fill="F0F9FF"/>
+            <w:tcBorders>
+              <w:left w:val="single" w:sz="36" w:space="0" w:color="0ea5e9"/>
+              <w:top w:val="none"/>
+              <w:bottom w:val="none"/>
+              <w:right w:val="none"/>
+            </w:tcBorders>
+            <w:tcMar>
+              <w:top w:w="150" w:type="dxa"/>
+              <w:bottom w:w="150" w:type="dxa"/>
+              <w:left w:w="250" w:type="dxa"/>
+              <w:right w:w="200" w:type="dxa"/>
+            </w:tcMar>
+          </w:tcPr>
+          <w:p>
+            <w:pPr>
+              <w:spacing w:before="0" w:after="80"/>
+            </w:pPr>
+            <w:r>
+              <w:rPr>
+                <w:rFonts w:ascii="Calibri" w:hAnsi="Calibri"/>
+                <w:b/>
+                <w:color w:val="0F172A"/>
+                <w:sz w:val="21"/>
+              </w:rPr>
+              <w:t>Principais Conclusões:</w:t>
+            </w:r>
+          </w:p>
+          <w:p>
+            <w:pPr>
+              <w:spacing w:before="80" w:after="80" w:line="276" w:lineRule="auto"/>
+            </w:pPr>
+            <w:r>
+              <w:rPr>
+                <w:rFonts w:ascii="Calibri" w:hAnsi="Calibri"/>
+                <w:color w:val="3C3C3C"/>
+                <w:sz w:val="20"/>
+              </w:rPr>
+              <w:t>• Ruptura de Paradigma: Dispensa convênios ou instrumentos complexos ex-ante.</w:t>
+            </w:r>
+          </w:p>
+          <w:p>
+            <w:pPr>
+              <w:spacing w:before="80" w:after="80" w:line="276" w:lineRule="auto"/>
+            </w:pPr>
+            <w:r>
+              <w:rPr>
+                <w:rFonts w:ascii="Calibri" w:hAnsi="Calibri"/>
+                <w:color w:val="3C3C3C"/>
+                <w:sz w:val="20"/>
+              </w:rPr>
+              <w:t>• Padronização Técnica: Utiliza metas pré-configuradas no sistema do Módulo de Gestão de Parcerias.</w:t>
+            </w:r>
+          </w:p>
+          <w:p>
+            <w:pPr>
+              <w:spacing w:before="80" w:after="80" w:line="276" w:lineRule="auto"/>
+            </w:pPr>
+            <w:r>
+              <w:rPr>
+                <w:rFonts w:ascii="Calibri" w:hAnsi="Calibri"/>
+                <w:color w:val="3C3C3C"/>
+                <w:sz w:val="20"/>
+              </w:rPr>
+              <w:t>• Solução de Estrutura Organizacional: Uso do SIORG 267384 (Depto. de Gestão de Fundos) para mapeamento administrativo.</w:t>
+            </w:r>
+          </w:p>
+          <w:p>
+            <w:pPr>
+              <w:spacing w:before="80" w:after="80" w:line="276" w:lineRule="auto"/>
+            </w:pPr>
+            <w:r>
+              <w:rPr>
+                <w:rFonts w:ascii="Calibri" w:hAnsi="Calibri"/>
+                <w:color w:val="3C3C3C"/>
+                <w:sz w:val="20"/>
+              </w:rPr>
+              <w:t>• Gestão de Riscos Diferenciada: Regras de exceção (como defeso eleitoral) parametrizadas por política pública.</w:t>
+            </w:r>
+          </w:p>
+          <w:p>
+            <w:pPr>
+              <w:spacing w:before="80" w:after="80" w:line="276" w:lineRule="auto"/>
+            </w:pPr>
+            <w:r>
+              <w:rPr>
+                <w:rFonts w:ascii="Calibri" w:hAnsi="Calibri"/>
+                <w:color w:val="3C3C3C"/>
+                <w:sz w:val="20"/>
+              </w:rPr>
+              <w:t>• Rastreabilidade Financeira: Integração com SIAFI para abertura automática de contas bancárias.</w:t>
+            </w:r>
+          </w:p>
+        </w:tc>
+      </w:tr>
+    </w:tbl>
+    <w:p>
+      <w:pPr>
+        <w:spacing w:before="120" w:after="120"/>
+      </w:pPr>
+    </w:p>
+    <w:p>
+      <w:pPr>
+        <w:keepNext/>
+        <w:spacing w:before="320" w:after="160"/>
+      </w:pPr>
+      <w:r>
+        <w:rPr>
+          <w:rFonts w:ascii="Calibri" w:hAnsi="Calibri"/>
+          <w:b/>
+          <w:color w:val="0F172A"/>
+          <w:sz w:val="28"/>
+        </w:rPr>
+        <w:t>2. Contexto Institucional e Base Normativa</w:t>
+      </w:r>
+    </w:p>
+    <w:p>
+      <w:pPr>
+        <w:spacing w:before="0" w:after="160" w:line="276" w:lineRule="auto"/>
+      </w:pPr>
+      <w:r>
+        <w:rPr>
+          <w:rFonts w:ascii="Calibri" w:hAnsi="Calibri"/>
+          <w:color w:val="334155"/>
+          <w:sz w:val="21"/>
+        </w:rPr>
+        <w:t>A implementação desta nova modalidade é sustentada pelo Acordo de Cooperação Técnica (ACT) firmado entre o MGI e os órgãos federais parceiros. Este acordo formaliza o suporte do órgão central para a internalização de políticas finalísticas no ecossistema digital de transferências da União.</w:t>
+      </w:r>
+    </w:p>
+    <w:tbl>
+      <w:tblPr>
+        <w:tblW w:type="auto" w:w="0"/>
+        <w:jc w:val="center"/>
+        <w:tblLayout w:type="fixed"/>
+        <w:tblLook w:firstColumn="1" w:firstRow="1" w:lastColumn="0" w:lastRow="0" w:noHBand="0" w:noVBand="1" w:val="04A0"/>
+      </w:tblPr>
+      <w:tblGrid>
+        <w:gridCol w:w="9360"/>
+      </w:tblGrid>
+      <w:tr>
+        <w:tc>
+          <w:tcPr>
+            <w:tcW w:type="dxa" w:w="8352"/>
+            <w:shd w:val="clear" w:color="auto" w:fill="F0FDF4"/>
             <w:tcBorders>
               <w:left w:val="single" w:sz="36" w:space="0" w:color="10b981"/>
               <w:top w:val="none"/>
@@ -110,10 +253,10 @@
               <w:rPr>
                 <w:rFonts w:ascii="Calibri" w:hAnsi="Calibri"/>
                 <w:b/>
-                <w:color w:val="0B111E"/>
+                <w:color w:val="0F172A"/>
                 <w:sz w:val="21"/>
               </w:rPr>
-              <w:t>Principais Conclusões da Cartilha:</w:t>
+              <w:t>Divisão de Responsabilidades:</w:t>
             </w:r>
           </w:p>
           <w:p>
@@ -126,7 +269,7 @@
                 <w:color w:val="3C3C3C"/>
                 <w:sz w:val="20"/>
               </w:rPr>
-              <w:t>• Ruptura de Paradigma: A Transferência Simplificada dispensa a celebração de convênios complexos ex-ante, focando no objeto físico.</w:t>
+              <w:t>Papel do MGI: Gestor central da Plataforma TRANSFEREGOV, provedor da infraestrutura técnica e do marco regulatório. Assegura conformidade legal e governança sistêmica.</w:t>
             </w:r>
           </w:p>
           <w:p>
@@ -139,46 +282,7 @@
                 <w:color w:val="3C3C3C"/>
                 <w:sz w:val="20"/>
               </w:rPr>
-              <w:t>• Padronização Técnica: O sistema utiliza metas pré-configuradas parametrizadas em cada edital, mitigando a burocracia ex-ante.</w:t>
-            </w:r>
-          </w:p>
-          <w:p>
-            <w:pPr>
-              <w:spacing w:before="80" w:after="80" w:line="276" w:lineRule="auto"/>
-            </w:pPr>
-            <w:r>
-              <w:rPr>
-                <w:rFonts w:ascii="Calibri" w:hAnsi="Calibri"/>
-                <w:color w:val="3C3C3C"/>
-                <w:sz w:val="20"/>
-              </w:rPr>
-              <w:t>• Solução de Estrutura Organizacional: A arquitetura sistêmica utiliza a vinculação de códigos do SIORG para mapeamento de responsabilidade de forma flexível.</w:t>
-            </w:r>
-          </w:p>
-          <w:p>
-            <w:pPr>
-              <w:spacing w:before="80" w:after="80" w:line="276" w:lineRule="auto"/>
-            </w:pPr>
-            <w:r>
-              <w:rPr>
-                <w:rFonts w:ascii="Calibri" w:hAnsi="Calibri"/>
-                <w:color w:val="3C3C3C"/>
-                <w:sz w:val="20"/>
-              </w:rPr>
-              <w:t>• Gestão de Riscos Diferenciada: Regras de exceção (como o defeso eleitoral) são parametrizadas no sistema de acordo com a base normativa de cada política pública.</w:t>
-            </w:r>
-          </w:p>
-          <w:p>
-            <w:pPr>
-              <w:spacing w:before="80" w:after="80" w:line="276" w:lineRule="auto"/>
-            </w:pPr>
-            <w:r>
-              <w:rPr>
-                <w:rFonts w:ascii="Calibri" w:hAnsi="Calibri"/>
-                <w:color w:val="3C3C3C"/>
-                <w:sz w:val="20"/>
-              </w:rPr>
-              <w:t>• Rastreabilidade Financeira: A integração nativa via API com bancos públicos credenciados garante a execução de ordens de pagamento em tempo real.</w:t>
+              <w:t>Papel dos Órgãos Parceiros: Autonomia total na gestão dos recursos de seus fundos, na definição das regras de negócio de suas políticas finalísticas e homologação de metas.</w:t>
             </w:r>
           </w:p>
         </w:tc>
@@ -192,16 +296,16 @@
     <w:p>
       <w:pPr>
         <w:keepNext/>
-        <w:spacing w:before="360" w:after="160"/>
+        <w:spacing w:before="320" w:after="160"/>
       </w:pPr>
       <w:r>
         <w:rPr>
           <w:rFonts w:ascii="Calibri" w:hAnsi="Calibri"/>
           <w:b/>
-          <w:color w:val="0B111E"/>
-          <w:sz w:val="30"/>
+          <w:color w:val="0F172A"/>
+          <w:sz w:val="28"/>
         </w:rPr>
-        <w:t>2. Contexto Institucional e Base Normativa</w:t>
+        <w:t>3. Arquitetura Técnica do TRANSFEREGOV</w:t>
       </w:r>
     </w:p>
     <w:p>
@@ -211,53 +315,10 @@
       <w:r>
         <w:rPr>
           <w:rFonts w:ascii="Calibri" w:hAnsi="Calibri"/>
-          <w:color w:val="3C3C3C"/>
-          <w:sz w:val="22"/>
+          <w:color w:val="334155"/>
+          <w:sz w:val="21"/>
         </w:rPr>
-        <w:t>A implementação desta modalidade é sustentada por Acordos de Cooperação Técnica (ACT) firmados entre o MGI e os órgãos concedentes. Esses acordos formalizam o suporte do órgão central para a internalização de políticas finalísticas no ecossistema digital de transferências da União, integrando tecnologia e inovação jurídica. A finalidade do TRANSFEREGOV.BR é operacionalizar a Transferência Simplificada, promovendo uma mudança de modelo mental: substitui-se a análise exaustiva de planos de trabalho densos pela adesão eletrônica a programas estruturados. O MGI atua como gestor central da plataforma pública, garantindo a governança sistêmica, enquanto cada órgão concedente mantém autonomia absoluta na gestão de seus fundos específicos e nas regras de negócio de suas políticas.</w:t>
-      </w:r>
-    </w:p>
-    <w:p>
-      <w:pPr>
-        <w:keepNext/>
-        <w:spacing w:before="360" w:after="160"/>
-      </w:pPr>
-      <w:r>
-        <w:rPr>
-          <w:rFonts w:ascii="Calibri" w:hAnsi="Calibri"/>
-          <w:b/>
-          <w:color w:val="0B111E"/>
-          <w:sz w:val="30"/>
-        </w:rPr>
-        <w:t>3. Arquitetura Técnica do TRANSFEREGOV.BR</w:t>
-      </w:r>
-    </w:p>
-    <w:p>
-      <w:pPr>
-        <w:spacing w:before="0" w:after="160" w:line="276" w:lineRule="auto"/>
-      </w:pPr>
-      <w:r>
-        <w:rPr>
-          <w:rFonts w:ascii="Calibri" w:hAnsi="Calibri"/>
-          <w:color w:val="3C3C3C"/>
-          <w:sz w:val="22"/>
-        </w:rPr>
-        <w:t>A robustez sistêmica do TRANSFEREGOV.BR é o que assegura a integridade dos recursos públicos federais. A arquitetura nativa da plataforma conduz o gestor por um fluxo lógico de conformidade operacional.</w:t>
-      </w:r>
-    </w:p>
-    <w:p>
-      <w:pPr>
-        <w:keepNext/>
-        <w:spacing w:before="240" w:after="120"/>
-      </w:pPr>
-      <w:r>
-        <w:rPr>
-          <w:rFonts w:ascii="Calibri" w:hAnsi="Calibri"/>
-          <w:b/>
-          <w:color w:val="10B981"/>
-          <w:sz w:val="24"/>
-        </w:rPr>
-        <w:t>Ambientes de Operação</w:t>
+        <w:t>A robustez sistêmica do TRANSFEREGOV assegura a integridade dos recursos. A arquitetura de desenvolvimento e execução é subdividida em três ambientes bem definidos:</w:t>
       </w:r>
     </w:p>
     <w:tbl>
@@ -268,15 +329,14 @@
         <w:tblLook w:firstColumn="1" w:firstRow="1" w:lastColumn="0" w:lastRow="0" w:noHBand="0" w:noVBand="1" w:val="04A0"/>
       </w:tblPr>
       <w:tblGrid>
-        <w:gridCol w:w="3120"/>
-        <w:gridCol w:w="3120"/>
-        <w:gridCol w:w="3120"/>
+        <w:gridCol w:w="4680"/>
+        <w:gridCol w:w="4680"/>
       </w:tblGrid>
       <w:tr>
         <w:tc>
           <w:tcPr>
-            <w:tcW w:type="dxa" w:w="3120"/>
-            <w:shd w:val="clear" w:color="auto" w:fill="0B111E"/>
+            <w:tcW w:type="dxa" w:w="4680"/>
+            <w:shd w:val="clear" w:color="auto" w:fill="0F172A"/>
           </w:tcPr>
           <w:p>
             <w:pPr>
@@ -294,8 +354,8 @@
         </w:tc>
         <w:tc>
           <w:tcPr>
-            <w:tcW w:type="dxa" w:w="3120"/>
-            <w:shd w:val="clear" w:color="auto" w:fill="0B111E"/>
+            <w:tcW w:type="dxa" w:w="4680"/>
+            <w:shd w:val="clear" w:color="auto" w:fill="0F172A"/>
           </w:tcPr>
           <w:p>
             <w:pPr>
@@ -307,26 +367,7 @@
                 <w:color w:val="FFFFFF"/>
                 <w:sz w:val="20"/>
               </w:rPr>
-              <w:t>Finalidade</w:t>
-            </w:r>
-          </w:p>
-        </w:tc>
-        <w:tc>
-          <w:tcPr>
-            <w:tcW w:type="dxa" w:w="3120"/>
-            <w:shd w:val="clear" w:color="auto" w:fill="0B111E"/>
-          </w:tcPr>
-          <w:p>
-            <w:pPr>
-              <w:jc w:val="center"/>
-            </w:pPr>
-            <w:r>
-              <w:rPr>
-                <w:b/>
-                <w:color w:val="FFFFFF"/>
-                <w:sz w:val="20"/>
-              </w:rPr>
-              <w:t>Impacto nos Dados Reais</w:t>
+              <w:t>Descrição e Finalidade</w:t>
             </w:r>
           </w:p>
         </w:tc>
@@ -334,8 +375,8 @@
       <w:tr>
         <w:tc>
           <w:tcPr>
-            <w:tcW w:type="dxa" w:w="3120"/>
-            <w:shd w:val="clear" w:color="auto" w:fill="F5F7FA"/>
+            <w:tcW w:type="dxa" w:w="4680"/>
+            <w:shd w:val="clear" w:color="auto" w:fill="F8FAFC"/>
           </w:tcPr>
           <w:p>
             <w:pPr>
@@ -346,13 +387,13 @@
                 <w:b/>
                 <w:sz w:val="19"/>
               </w:rPr>
-              <w:t>Treinamento</w:t>
+              <w:t>1. Treinamento</w:t>
             </w:r>
           </w:p>
         </w:tc>
         <w:tc>
           <w:tcPr>
-            <w:tcW w:type="dxa" w:w="3120"/>
+            <w:tcW w:type="dxa" w:w="4680"/>
           </w:tcPr>
           <w:p>
             <w:pPr>
@@ -362,23 +403,7 @@
               <w:rPr>
                 <w:sz w:val="19"/>
               </w:rPr>
-              <w:t>Simulação e aprendizado das equipes técnicas locais.</w:t>
-            </w:r>
-          </w:p>
-        </w:tc>
-        <w:tc>
-          <w:tcPr>
-            <w:tcW w:type="dxa" w:w="3120"/>
-          </w:tcPr>
-          <w:p>
-            <w:pPr>
-              <w:jc w:val="left"/>
-            </w:pPr>
-            <w:r>
-              <w:rPr>
-                <w:sz w:val="19"/>
-              </w:rPr>
-              <w:t>Nenhum (ambiente de sandbox isolado).</w:t>
+              <w:t>Simulação e sandbox para capacitação de técnicos locais sem risco fiscal ou transações reais.</w:t>
             </w:r>
           </w:p>
         </w:tc>
@@ -386,8 +411,8 @@
       <w:tr>
         <w:tc>
           <w:tcPr>
-            <w:tcW w:type="dxa" w:w="3120"/>
-            <w:shd w:val="clear" w:color="auto" w:fill="F5F7FA"/>
+            <w:tcW w:type="dxa" w:w="4680"/>
+            <w:shd w:val="clear" w:color="auto" w:fill="F8FAFC"/>
           </w:tcPr>
           <w:p>
             <w:pPr>
@@ -398,13 +423,13 @@
                 <w:b/>
                 <w:sz w:val="19"/>
               </w:rPr>
-              <w:t>Homologação</w:t>
+              <w:t>2. Homologação</w:t>
             </w:r>
           </w:p>
         </w:tc>
         <w:tc>
           <w:tcPr>
-            <w:tcW w:type="dxa" w:w="3120"/>
+            <w:tcW w:type="dxa" w:w="4680"/>
           </w:tcPr>
           <w:p>
             <w:pPr>
@@ -414,23 +439,7 @@
               <w:rPr>
                 <w:sz w:val="19"/>
               </w:rPr>
-              <w:t>Testes finais de fluxos e parametrizações de editais.</w:t>
-            </w:r>
-          </w:p>
-        </w:tc>
-        <w:tc>
-          <w:tcPr>
-            <w:tcW w:type="dxa" w:w="3120"/>
-          </w:tcPr>
-          <w:p>
-            <w:pPr>
-              <w:jc w:val="left"/>
-            </w:pPr>
-            <w:r>
-              <w:rPr>
-                <w:sz w:val="19"/>
-              </w:rPr>
-              <w:t>Nenhum (espelho de testes sem efeito contábil).</w:t>
+              <w:t>Testes de integração bancária via API e validações finais de layouts antes da implantação.</w:t>
             </w:r>
           </w:p>
         </w:tc>
@@ -438,8 +447,8 @@
       <w:tr>
         <w:tc>
           <w:tcPr>
-            <w:tcW w:type="dxa" w:w="3120"/>
-            <w:shd w:val="clear" w:color="auto" w:fill="F5F7FA"/>
+            <w:tcW w:type="dxa" w:w="4680"/>
+            <w:shd w:val="clear" w:color="auto" w:fill="F8FAFC"/>
           </w:tcPr>
           <w:p>
             <w:pPr>
@@ -450,13 +459,13 @@
                 <w:b/>
                 <w:sz w:val="19"/>
               </w:rPr>
-              <w:t>Produção</w:t>
+              <w:t>3. Produção</w:t>
             </w:r>
           </w:p>
         </w:tc>
         <w:tc>
           <w:tcPr>
-            <w:tcW w:type="dxa" w:w="3120"/>
+            <w:tcW w:type="dxa" w:w="4680"/>
           </w:tcPr>
           <w:p>
             <w:pPr>
@@ -466,23 +475,7 @@
               <w:rPr>
                 <w:sz w:val="19"/>
               </w:rPr>
-              <w:t>Uso real para empenho, pagamento e execução oficial.</w:t>
-            </w:r>
-          </w:p>
-        </w:tc>
-        <w:tc>
-          <w:tcPr>
-            <w:tcW w:type="dxa" w:w="3120"/>
-          </w:tcPr>
-          <w:p>
-            <w:pPr>
-              <w:jc w:val="left"/>
-            </w:pPr>
-            <w:r>
-              <w:rPr>
-                <w:sz w:val="19"/>
-              </w:rPr>
-              <w:t>Jurídico e financeiro efetivo e real.</w:t>
+              <w:t>Execução oficial e jurídica. Repasses efetivos, empenhos e monitoramento de metas.</w:t>
             </w:r>
           </w:p>
         </w:tc>
@@ -490,23 +483,8 @@
     </w:tbl>
     <w:p>
       <w:pPr>
-        <w:spacing w:before="160"/>
+        <w:spacing w:before="120"/>
       </w:pPr>
-    </w:p>
-    <w:p>
-      <w:pPr>
-        <w:keepNext/>
-        <w:spacing w:before="240" w:after="120"/>
-      </w:pPr>
-      <w:r>
-        <w:rPr>
-          <w:rFonts w:ascii="Calibri" w:hAnsi="Calibri"/>
-          <w:b/>
-          <w:color w:val="10B981"/>
-          <w:sz w:val="24"/>
-        </w:rPr>
-        <w:t>Integrações Críticas e Regras do Sistema</w:t>
-      </w:r>
     </w:p>
     <w:p>
       <w:pPr>
@@ -515,36 +493,23 @@
       <w:r>
         <w:rPr>
           <w:rFonts w:ascii="Calibri" w:hAnsi="Calibri"/>
-          <w:color w:val="3C3C3C"/>
-          <w:sz w:val="22"/>
+          <w:color w:val="334155"/>
+          <w:sz w:val="21"/>
         </w:rPr>
-        <w:t>SIORG e Unidade Gestora: Para viabilizar a vinculação administrativa de conselhos ou fundos finalísticos que não possuam código de Unidade Gestora própria, a solução técnica consiste em mapear a responsabilidade operacional via código de SIORG (ex: código do Departamento Gestor de Recursos - 267384). Os servidores finalísticos podem ter perfis associados a múltiplos órgãos no sistema para garantir a governança e segregação completa de papéis.</w:t>
-      </w:r>
-    </w:p>
-    <w:p>
-      <w:pPr>
-        <w:spacing w:before="0" w:after="160" w:line="276" w:lineRule="auto"/>
-      </w:pPr>
-      <w:r>
-        <w:rPr>
-          <w:rFonts w:ascii="Calibri" w:hAnsi="Calibri"/>
-          <w:color w:val="3C3C3C"/>
-          <w:sz w:val="22"/>
-        </w:rPr>
-        <w:t>SIAFI: A execução financeira ocorre de forma integrada, garantindo que o recurso seja reservado e transferido diretamente à conta específica do ente beneficiário logo após a aprovação técnica da manifestação de interesse.</w:t>
+        <w:t>Solução Técnica SIORG: Para contornar eventuais ausências de um código de Unidade Gestora próprio, a arquitetura utiliza o SIORG do Departamento de Gestão de Fundos e de Recursos Externos (267384).</w:t>
       </w:r>
     </w:p>
     <w:p>
       <w:pPr>
         <w:keepNext/>
-        <w:spacing w:before="360" w:after="160"/>
+        <w:spacing w:before="320" w:after="160"/>
       </w:pPr>
       <w:r>
         <w:rPr>
           <w:rFonts w:ascii="Calibri" w:hAnsi="Calibri"/>
           <w:b/>
-          <w:color w:val="0B111E"/>
-          <w:sz w:val="30"/>
+          <w:color w:val="0F172A"/>
+          <w:sz w:val="28"/>
         </w:rPr>
         <w:t>4. Parametrização por Política Pública</w:t>
       </w:r>
@@ -556,10 +521,25 @@
       <w:r>
         <w:rPr>
           <w:rFonts w:ascii="Calibri" w:hAnsi="Calibri"/>
-          <w:color w:val="3C3C3C"/>
-          <w:sz w:val="22"/>
+          <w:color w:val="334155"/>
+          <w:sz w:val="21"/>
         </w:rPr>
-        <w:t>O Módulo de Gestão de Parcerias oferece flexibilidade para adaptar-se ao desenho de diferentes políticas finalísticas, utilizando nomenclaturas padronizadas e parâmetros sistêmicos:</w:t>
+        <w:t>O Módulo de Gestão de Parcerias do TRANSFEREGOV adapta-se às particularidades das diversas políticas públicas por meio de parametrização no sistema:</w:t>
+      </w:r>
+    </w:p>
+    <w:p>
+      <w:pPr>
+        <w:keepNext/>
+        <w:spacing w:before="240" w:after="120"/>
+      </w:pPr>
+      <w:r>
+        <w:rPr>
+          <w:rFonts w:ascii="Calibri" w:hAnsi="Calibri"/>
+          <w:b/>
+          <w:color w:val="0369A1"/>
+          <w:sz w:val="23"/>
+        </w:rPr>
+        <w:t>1. Requisitos de Habilitação</w:t>
       </w:r>
     </w:p>
     <w:p>
@@ -569,10 +549,25 @@
       <w:r>
         <w:rPr>
           <w:rFonts w:ascii="Calibri" w:hAnsi="Calibri"/>
-          <w:color w:val="3C3C3C"/>
-          <w:sz w:val="22"/>
+          <w:color w:val="334155"/>
+          <w:sz w:val="21"/>
         </w:rPr>
-        <w:t>• Metas Padronizadas: O órgão concedente predefine metas físicas e quantificáveis no edital (ex: atendimentos efetuados, esterilizações realizadas, equipamentos adquiridos), impedindo o cadastro de metas sem foco prático e agilizando a adesão.</w:t>
+        <w:t>Configuração automatizada de critérios fiscais, jurídicos e técnicos que os entes devem cumprir eletronicamente.</w:t>
+      </w:r>
+    </w:p>
+    <w:p>
+      <w:pPr>
+        <w:keepNext/>
+        <w:spacing w:before="240" w:after="120"/>
+      </w:pPr>
+      <w:r>
+        <w:rPr>
+          <w:rFonts w:ascii="Calibri" w:hAnsi="Calibri"/>
+          <w:b/>
+          <w:color w:val="0369A1"/>
+          <w:sz w:val="23"/>
+        </w:rPr>
+        <w:t>2. Anexos e Documentos Customizados</w:t>
       </w:r>
     </w:p>
     <w:p>
@@ -582,10 +577,25 @@
       <w:r>
         <w:rPr>
           <w:rFonts w:ascii="Calibri" w:hAnsi="Calibri"/>
-          <w:color w:val="3C3C3C"/>
-          <w:sz w:val="22"/>
+          <w:color w:val="334155"/>
+          <w:sz w:val="21"/>
         </w:rPr>
-        <w:t>• Recortes e Parametrizações Regionais: Possibilidade de limitar a concorrência e os chamamentos a áreas geográficas específicas (ex: estados da Amazônia Legal, biomas sensíveis ou faixas populacionais), otimizando a distribuição de recursos.</w:t>
+        <w:t>Possibilidade de limitar a adesão apenas a proponentes que anexarem planos setoriais específicos (ex: planos de contingência, declarações clínicas).</w:t>
+      </w:r>
+    </w:p>
+    <w:p>
+      <w:pPr>
+        <w:keepNext/>
+        <w:spacing w:before="240" w:after="120"/>
+      </w:pPr>
+      <w:r>
+        <w:rPr>
+          <w:rFonts w:ascii="Calibri" w:hAnsi="Calibri"/>
+          <w:b/>
+          <w:color w:val="0369A1"/>
+          <w:sz w:val="23"/>
+        </w:rPr>
+        <w:t>3. Metas Padronizadas</w:t>
       </w:r>
     </w:p>
     <w:p>
@@ -595,25 +605,25 @@
       <w:r>
         <w:rPr>
           <w:rFonts w:ascii="Calibri" w:hAnsi="Calibri"/>
-          <w:color w:val="3C3C3C"/>
-          <w:sz w:val="22"/>
+          <w:color w:val="334155"/>
+          <w:sz w:val="21"/>
         </w:rPr>
-        <w:t>• Habilitação Documental por Anexos: Configuração de critérios jurídicos e envio eletrônico de documentos obrigatórios como condição vinculante no rito operacional do sistema.</w:t>
+        <w:t>Conjunto de objetivos de entrega física e quantificável pré-configurados para a rápida adesão dos estados e municípios.</w:t>
       </w:r>
     </w:p>
     <w:p>
       <w:pPr>
         <w:keepNext/>
-        <w:spacing w:before="360" w:after="160"/>
+        <w:spacing w:before="320" w:after="160"/>
       </w:pPr>
       <w:r>
         <w:rPr>
           <w:rFonts w:ascii="Calibri" w:hAnsi="Calibri"/>
           <w:b/>
-          <w:color w:val="0B111E"/>
-          <w:sz w:val="30"/>
+          <w:color w:val="0F172A"/>
+          <w:sz w:val="28"/>
         </w:rPr>
-        <w:t>5. Jornada da Transferência: Do Chamamento à Execução</w:t>
+        <w:t>5. Ordem de Pagamento de Parcerias (OPP)</w:t>
       </w:r>
     </w:p>
     <w:p>
@@ -623,10 +633,25 @@
       <w:r>
         <w:rPr>
           <w:rFonts w:ascii="Calibri" w:hAnsi="Calibri"/>
-          <w:color w:val="3C3C3C"/>
-          <w:sz w:val="22"/>
+          <w:color w:val="334155"/>
+          <w:sz w:val="21"/>
         </w:rPr>
-        <w:t>A jornada operacional substitui o Plano de Trabalho denso por um rito de adesão eletrônica e anuência, estruturado em etapas sequenciais:</w:t>
+        <w:t>A Ordem de Pagamento de Parcerias (OPP) representa a automação definitiva do ciclo de execução financeira no Módulo de Gestão de Parcerias do TRANSFEREGOV. Ela desburocratiza e assegura o fluxo de recursos públicos federais:</w:t>
+      </w:r>
+    </w:p>
+    <w:p>
+      <w:pPr>
+        <w:keepNext/>
+        <w:spacing w:before="240" w:after="120"/>
+      </w:pPr>
+      <w:r>
+        <w:rPr>
+          <w:rFonts w:ascii="Calibri" w:hAnsi="Calibri"/>
+          <w:b/>
+          <w:color w:val="0369A1"/>
+          <w:sz w:val="23"/>
+        </w:rPr>
+        <w:t>⚡ Tempo Real via API</w:t>
       </w:r>
     </w:p>
     <w:p>
@@ -636,10 +661,25 @@
       <w:r>
         <w:rPr>
           <w:rFonts w:ascii="Calibri" w:hAnsi="Calibri"/>
-          <w:color w:val="3C3C3C"/>
-          <w:sz w:val="22"/>
+          <w:color w:val="334155"/>
+          <w:sz w:val="21"/>
         </w:rPr>
-        <w:t>1. Convocatória (Programa): O órgão concedente federal publica a chamada no Módulo de Gestão de Parcerias, configurando as metas padronizadas e prazos.</w:t>
+        <w:t>Integração nativa com BB, Caixa e BNB, eliminando o processamento em lote (batch).</w:t>
+      </w:r>
+    </w:p>
+    <w:p>
+      <w:pPr>
+        <w:keepNext/>
+        <w:spacing w:before="240" w:after="120"/>
+      </w:pPr>
+      <w:r>
+        <w:rPr>
+          <w:rFonts w:ascii="Calibri" w:hAnsi="Calibri"/>
+          <w:b/>
+          <w:color w:val="0369A1"/>
+          <w:sz w:val="23"/>
+        </w:rPr>
+        <w:t>🛡️ Dupla Assinatura</w:t>
       </w:r>
     </w:p>
     <w:p>
@@ -649,10 +689,25 @@
       <w:r>
         <w:rPr>
           <w:rFonts w:ascii="Calibri" w:hAnsi="Calibri"/>
-          <w:color w:val="3C3C3C"/>
-          <w:sz w:val="22"/>
+          <w:color w:val="334155"/>
+          <w:sz w:val="21"/>
         </w:rPr>
-        <w:t>2. Manifestação de Interesse: O ente subnacional (estado, município ou OSC) adere digitalmente à chamada, anexando a documentação mínima de habilitação.</w:t>
+        <w:t>Assinatura eletrônica em dupla autenticação (Operador/Gestor) via Gov.br Ouro.</w:t>
+      </w:r>
+    </w:p>
+    <w:p>
+      <w:pPr>
+        <w:keepNext/>
+        <w:spacing w:before="240" w:after="120"/>
+      </w:pPr>
+      <w:r>
+        <w:rPr>
+          <w:rFonts w:ascii="Calibri" w:hAnsi="Calibri"/>
+          <w:b/>
+          <w:color w:val="0369A1"/>
+          <w:sz w:val="23"/>
+        </w:rPr>
+        <w:t>📱 Pix e QR Code</w:t>
       </w:r>
     </w:p>
     <w:p>
@@ -662,10 +717,25 @@
       <w:r>
         <w:rPr>
           <w:rFonts w:ascii="Calibri" w:hAnsi="Calibri"/>
-          <w:color w:val="3C3C3C"/>
-          <w:sz w:val="22"/>
+          <w:color w:val="334155"/>
+          <w:sz w:val="21"/>
         </w:rPr>
-        <w:t>3. Análise e Validação: O órgão concedente valida de forma ágil a documentação de conformidade técnica e jurídica.</w:t>
+        <w:t>Quitação direta de fornecedores locais na ponta sem saques intermediários.</w:t>
+      </w:r>
+    </w:p>
+    <w:p>
+      <w:pPr>
+        <w:keepNext/>
+        <w:spacing w:before="240" w:after="120"/>
+      </w:pPr>
+      <w:r>
+        <w:rPr>
+          <w:rFonts w:ascii="Calibri" w:hAnsi="Calibri"/>
+          <w:b/>
+          <w:color w:val="0369A1"/>
+          <w:sz w:val="23"/>
+        </w:rPr>
+        <w:t>⚙️ Controle Ativo</w:t>
       </w:r>
     </w:p>
     <w:p>
@@ -675,38 +745,10 @@
       <w:r>
         <w:rPr>
           <w:rFonts w:ascii="Calibri" w:hAnsi="Calibri"/>
-          <w:color w:val="3C3C3C"/>
-          <w:sz w:val="22"/>
+          <w:color w:val="334155"/>
+          <w:sz w:val="21"/>
         </w:rPr>
-        <w:t>4. Empenho e Abertura de Conta: O sistema realiza a reserva orçamentária no SIAFI e gera automaticamente a conta bancária vinculada via API bancária.</w:t>
-      </w:r>
-    </w:p>
-    <w:p>
-      <w:pPr>
-        <w:spacing w:before="0" w:after="160" w:line="276" w:lineRule="auto"/>
-      </w:pPr>
-      <w:r>
-        <w:rPr>
-          <w:rFonts w:ascii="Calibri" w:hAnsi="Calibri"/>
-          <w:color w:val="3C3C3C"/>
-          <w:sz w:val="22"/>
-        </w:rPr>
-        <w:t>5. Execução e Entrega Física: O ente executa as metas físicas contratadas. A comprovação utiliza o envio de relatórios simplificados integrados a ferramentas setoriais.</w:t>
-      </w:r>
-    </w:p>
-    <w:p>
-      <w:pPr>
-        <w:keepNext/>
-        <w:spacing w:before="360" w:after="160"/>
-      </w:pPr>
-      <w:r>
-        <w:rPr>
-          <w:rFonts w:ascii="Calibri" w:hAnsi="Calibri"/>
-          <w:b/>
-          <w:color w:val="0B111E"/>
-          <w:sz w:val="30"/>
-        </w:rPr>
-        <w:t>6. Dúvidas e Esclarecimentos (FAQ)</w:t>
+        <w:t>Bloqueio e desbloqueio remoto de contas bancárias pelo órgão concedente.</w:t>
       </w:r>
     </w:p>
     <w:tbl>
@@ -723,9 +765,9 @@
         <w:tc>
           <w:tcPr>
             <w:tcW w:type="dxa" w:w="8352"/>
-            <w:shd w:val="clear" w:color="auto" w:fill="F0F8FF"/>
+            <w:shd w:val="clear" w:color="auto" w:fill="FFFDF0"/>
             <w:tcBorders>
-              <w:left w:val="single" w:sz="36" w:space="0" w:color="4facfe"/>
+              <w:left w:val="single" w:sz="36" w:space="0" w:color="f59e0b"/>
               <w:top w:val="none"/>
               <w:bottom w:val="none"/>
               <w:right w:val="none"/>
@@ -745,10 +787,10 @@
               <w:rPr>
                 <w:rFonts w:ascii="Calibri" w:hAnsi="Calibri"/>
                 <w:b/>
-                <w:color w:val="0B111E"/>
+                <w:color w:val="0F172A"/>
                 <w:sz w:val="21"/>
               </w:rPr>
-              <w:t>Como vincular o sistema se a área gestora do fundo não tem Unidade Gestora própria?</w:t>
+              <w:t>Ficha Técnica Operacional:</w:t>
             </w:r>
           </w:p>
           <w:p>
@@ -761,7 +803,178 @@
                 <w:color w:val="3C3C3C"/>
                 <w:sz w:val="20"/>
               </w:rPr>
-              <w:t>Resposta: Será utilizado o código de SIORG da unidade superior responsável (ex: código do Departamento de Gestão de Fundos - 267384) com a atribuição de perfis de acesso vinculados no sistema. Resolvido. Criticidade: Alta.</w:t>
+              <w:t>Ficha Técnica e Prazos: Abertura de conta via API bancária em 3 a 5 segundos; Janela de operação das 07h às 19h30; transações via Pix sem teto de valor.</w:t>
+            </w:r>
+          </w:p>
+        </w:tc>
+      </w:tr>
+    </w:tbl>
+    <w:p>
+      <w:pPr>
+        <w:spacing w:before="120" w:after="120"/>
+      </w:pPr>
+    </w:p>
+    <w:p>
+      <w:pPr>
+        <w:keepNext/>
+        <w:spacing w:before="320" w:after="160"/>
+      </w:pPr>
+      <w:r>
+        <w:rPr>
+          <w:rFonts w:ascii="Calibri" w:hAnsi="Calibri"/>
+          <w:b/>
+          <w:color w:val="0F172A"/>
+          <w:sz w:val="28"/>
+        </w:rPr>
+        <w:t>6. Jornada da Transferência</w:t>
+      </w:r>
+    </w:p>
+    <w:p>
+      <w:pPr>
+        <w:spacing w:before="0" w:after="160" w:line="276" w:lineRule="auto"/>
+      </w:pPr>
+      <w:r>
+        <w:rPr>
+          <w:rFonts w:ascii="Calibri" w:hAnsi="Calibri"/>
+          <w:color w:val="334155"/>
+          <w:sz w:val="21"/>
+        </w:rPr>
+        <w:t>O fluxo lógico simplificado é estruturado em etapas claras que substituem a burocracia documental tradicional por validações diretas:</w:t>
+      </w:r>
+    </w:p>
+    <w:p>
+      <w:pPr>
+        <w:spacing w:before="0" w:after="160" w:line="276" w:lineRule="auto"/>
+      </w:pPr>
+      <w:r>
+        <w:rPr>
+          <w:rFonts w:ascii="Calibri" w:hAnsi="Calibri"/>
+          <w:color w:val="334155"/>
+          <w:sz w:val="21"/>
+        </w:rPr>
+        <w:t>• 01. Convocatória: Cadastro das regras e metas no sistema pelo órgão concedente.</w:t>
+      </w:r>
+    </w:p>
+    <w:p>
+      <w:pPr>
+        <w:spacing w:before="0" w:after="160" w:line="276" w:lineRule="auto"/>
+      </w:pPr>
+      <w:r>
+        <w:rPr>
+          <w:rFonts w:ascii="Calibri" w:hAnsi="Calibri"/>
+          <w:color w:val="334155"/>
+          <w:sz w:val="21"/>
+        </w:rPr>
+        <w:t>• 02. Manifestação de Interesse: Adesão digital rápida e sem burocracia pelo ente parceiro.</w:t>
+      </w:r>
+    </w:p>
+    <w:p>
+      <w:pPr>
+        <w:spacing w:before="0" w:after="160" w:line="276" w:lineRule="auto"/>
+      </w:pPr>
+      <w:r>
+        <w:rPr>
+          <w:rFonts w:ascii="Calibri" w:hAnsi="Calibri"/>
+          <w:color w:val="334155"/>
+          <w:sz w:val="21"/>
+        </w:rPr>
+        <w:t>• 03. Validação Técnica: Avaliação expedita e verificação dos critérios automatizados.</w:t>
+      </w:r>
+    </w:p>
+    <w:p>
+      <w:pPr>
+        <w:spacing w:before="0" w:after="160" w:line="276" w:lineRule="auto"/>
+      </w:pPr>
+      <w:r>
+        <w:rPr>
+          <w:rFonts w:ascii="Calibri" w:hAnsi="Calibri"/>
+          <w:color w:val="334155"/>
+          <w:sz w:val="21"/>
+        </w:rPr>
+        <w:t>• 04. Empenho e Desembolso: Abertura automática de conta e execução via SIAFI.</w:t>
+      </w:r>
+    </w:p>
+    <w:p>
+      <w:pPr>
+        <w:spacing w:before="0" w:after="160" w:line="276" w:lineRule="auto"/>
+      </w:pPr>
+      <w:r>
+        <w:rPr>
+          <w:rFonts w:ascii="Calibri" w:hAnsi="Calibri"/>
+          <w:color w:val="334155"/>
+          <w:sz w:val="21"/>
+        </w:rPr>
+        <w:t>• 05. Execução e Monitoramento: Comprovação das metas físicas no próprio TRANSFEREGOV.</w:t>
+      </w:r>
+    </w:p>
+    <w:p>
+      <w:pPr>
+        <w:keepNext/>
+        <w:spacing w:before="320" w:after="160"/>
+      </w:pPr>
+      <w:r>
+        <w:rPr>
+          <w:rFonts w:ascii="Calibri" w:hAnsi="Calibri"/>
+          <w:b/>
+          <w:color w:val="0F172A"/>
+          <w:sz w:val="28"/>
+        </w:rPr>
+        <w:t>7. Dúvidas Operacionais (FAQ)</w:t>
+      </w:r>
+    </w:p>
+    <w:tbl>
+      <w:tblPr>
+        <w:tblW w:type="auto" w:w="0"/>
+        <w:jc w:val="center"/>
+        <w:tblLayout w:type="fixed"/>
+        <w:tblLook w:firstColumn="1" w:firstRow="1" w:lastColumn="0" w:lastRow="0" w:noHBand="0" w:noVBand="1" w:val="04A0"/>
+      </w:tblPr>
+      <w:tblGrid>
+        <w:gridCol w:w="9360"/>
+      </w:tblGrid>
+      <w:tr>
+        <w:tc>
+          <w:tcPr>
+            <w:tcW w:type="dxa" w:w="8352"/>
+            <w:shd w:val="clear" w:color="auto" w:fill="F0F9FF"/>
+            <w:tcBorders>
+              <w:left w:val="single" w:sz="36" w:space="0" w:color="0284c7"/>
+              <w:top w:val="none"/>
+              <w:bottom w:val="none"/>
+              <w:right w:val="none"/>
+            </w:tcBorders>
+            <w:tcMar>
+              <w:top w:w="150" w:type="dxa"/>
+              <w:bottom w:w="150" w:type="dxa"/>
+              <w:left w:w="250" w:type="dxa"/>
+              <w:right w:w="200" w:type="dxa"/>
+            </w:tcMar>
+          </w:tcPr>
+          <w:p>
+            <w:pPr>
+              <w:spacing w:before="0" w:after="80"/>
+            </w:pPr>
+            <w:r>
+              <w:rPr>
+                <w:rFonts w:ascii="Calibri" w:hAnsi="Calibri"/>
+                <w:b/>
+                <w:color w:val="0F172A"/>
+                <w:sz w:val="21"/>
+              </w:rPr>
+              <w:t>❓ Como funciona o processo de adesão ao Módulo de Gestão de Parcerias no TRANSFEREGOV?</w:t>
+            </w:r>
+          </w:p>
+          <w:p>
+            <w:pPr>
+              <w:spacing w:before="80" w:after="80" w:line="276" w:lineRule="auto"/>
+            </w:pPr>
+            <w:r>
+              <w:rPr>
+                <w:rFonts w:ascii="Calibri" w:hAnsi="Calibri"/>
+                <w:color w:val="3C3C3C"/>
+                <w:sz w:val="20"/>
+              </w:rPr>
+              <w:t>O processo de adesão é 100% eletrônico. O Ente federado (Estado ou Município) localiza a chamada pública de seu interesse no TRANSFEREGOV e manifesta interesse aderindo diretamente pelo sistema, preenchendo as informações solicitadas e assinando digitalmente o termo.</w:t>
             </w:r>
           </w:p>
         </w:tc>
@@ -786,9 +999,9 @@
         <w:tc>
           <w:tcPr>
             <w:tcW w:type="dxa" w:w="8352"/>
-            <w:shd w:val="clear" w:color="auto" w:fill="F0F8FF"/>
+            <w:shd w:val="clear" w:color="auto" w:fill="F0F9FF"/>
             <w:tcBorders>
-              <w:left w:val="single" w:sz="36" w:space="0" w:color="4facfe"/>
+              <w:left w:val="single" w:sz="36" w:space="0" w:color="0284c7"/>
               <w:top w:val="none"/>
               <w:bottom w:val="none"/>
               <w:right w:val="none"/>
@@ -808,10 +1021,10 @@
               <w:rPr>
                 <w:rFonts w:ascii="Calibri" w:hAnsi="Calibri"/>
                 <w:b/>
-                <w:color w:val="0B111E"/>
+                <w:color w:val="0F172A"/>
                 <w:sz w:val="21"/>
               </w:rPr>
-              <w:t>Os entes parceiros podem realizar repasses a entidades locais do terceiro setor (OSCs)?</w:t>
+              <w:t>❓ O que é a parametrização das políticas públicas?</w:t>
             </w:r>
           </w:p>
           <w:p>
@@ -824,7 +1037,7 @@
                 <w:color w:val="3C3C3C"/>
                 <w:sz w:val="20"/>
               </w:rPr>
-              <w:t>Resposta: Sim, o Módulo de Gestão de Parcerias viabiliza a execução por estados, municípios e diretamente por Organizações da Sociedade Civil (OSCs), além de modelos de Estado Repressor. Em análise técnica. Criticidade: Média.</w:t>
+              <w:t>É a flexibilidade dada aos órgãos federais concedentes para predefinir as regras de negócio, metas padronizadas e documentos obrigatórios para cada programa finalístico de repasse, adaptando o sistema às demandas específicas de cada setor.</w:t>
             </w:r>
           </w:p>
         </w:tc>
@@ -849,9 +1062,9 @@
         <w:tc>
           <w:tcPr>
             <w:tcW w:type="dxa" w:w="8352"/>
-            <w:shd w:val="clear" w:color="auto" w:fill="F0F8FF"/>
+            <w:shd w:val="clear" w:color="auto" w:fill="F0F9FF"/>
             <w:tcBorders>
-              <w:left w:val="single" w:sz="36" w:space="0" w:color="4facfe"/>
+              <w:left w:val="single" w:sz="36" w:space="0" w:color="0284c7"/>
               <w:top w:val="none"/>
               <w:bottom w:val="none"/>
               <w:right w:val="none"/>
@@ -871,10 +1084,10 @@
               <w:rPr>
                 <w:rFonts w:ascii="Calibri" w:hAnsi="Calibri"/>
                 <w:b/>
-                <w:color w:val="0B111E"/>
+                <w:color w:val="0F172A"/>
                 <w:sz w:val="21"/>
               </w:rPr>
-              <w:t>Como garantir a entrega de planos ou produtos pactuados após a liberação do repasse?</w:t>
+              <w:t>❓ Qual o papel do ambiente de Treinamento?</w:t>
             </w:r>
           </w:p>
           <w:p>
@@ -887,85 +1100,7 @@
                 <w:color w:val="3C3C3C"/>
                 <w:sz w:val="20"/>
               </w:rPr>
-              <w:t>Resposta: Utiliza-se a Cláusula Suspensiva, que condiciona a liberação das parcelas financeiras seguintes à entrega física das etapas anteriores no sistema. Resolvido. Criticidade: Alta.</w:t>
-            </w:r>
-          </w:p>
-        </w:tc>
-      </w:tr>
-    </w:tbl>
-    <w:p>
-      <w:pPr>
-        <w:spacing w:before="120" w:after="120"/>
-      </w:pPr>
-    </w:p>
-    <w:p>
-      <w:pPr>
-        <w:keepNext/>
-        <w:spacing w:before="360" w:after="160"/>
-      </w:pPr>
-      <w:r>
-        <w:rPr>
-          <w:rFonts w:ascii="Calibri" w:hAnsi="Calibri"/>
-          <w:b/>
-          <w:color w:val="0B111E"/>
-          <w:sz w:val="30"/>
-        </w:rPr>
-        <w:t>7. Pontos de Atenção e Gestão de Riscos</w:t>
-      </w:r>
-    </w:p>
-    <w:tbl>
-      <w:tblPr>
-        <w:tblW w:type="auto" w:w="0"/>
-        <w:jc w:val="center"/>
-        <w:tblLayout w:type="fixed"/>
-        <w:tblLook w:firstColumn="1" w:firstRow="1" w:lastColumn="0" w:lastRow="0" w:noHBand="0" w:noVBand="1" w:val="04A0"/>
-      </w:tblPr>
-      <w:tblGrid>
-        <w:gridCol w:w="9360"/>
-      </w:tblGrid>
-      <w:tr>
-        <w:tc>
-          <w:tcPr>
-            <w:tcW w:type="dxa" w:w="8352"/>
-            <w:shd w:val="clear" w:color="auto" w:fill="FFF5F5"/>
-            <w:tcBorders>
-              <w:left w:val="single" w:sz="36" w:space="0" w:color="dc3545"/>
-              <w:top w:val="none"/>
-              <w:bottom w:val="none"/>
-              <w:right w:val="none"/>
-            </w:tcBorders>
-            <w:tcMar>
-              <w:top w:w="150" w:type="dxa"/>
-              <w:bottom w:w="150" w:type="dxa"/>
-              <w:left w:w="250" w:type="dxa"/>
-              <w:right w:w="200" w:type="dxa"/>
-            </w:tcMar>
-          </w:tcPr>
-          <w:p>
-            <w:pPr>
-              <w:spacing w:before="0" w:after="80"/>
-            </w:pPr>
-            <w:r>
-              <w:rPr>
-                <w:rFonts w:ascii="Calibri" w:hAnsi="Calibri"/>
-                <w:b/>
-                <w:color w:val="0B111E"/>
-                <w:sz w:val="21"/>
-              </w:rPr>
-              <w:t>Risco 1: "Sintoma do Convênio" (Resistência Técnica)</w:t>
-            </w:r>
-          </w:p>
-          <w:p>
-            <w:pPr>
-              <w:spacing w:before="80" w:after="80" w:line="276" w:lineRule="auto"/>
-            </w:pPr>
-            <w:r>
-              <w:rPr>
-                <w:rFonts w:ascii="Calibri" w:hAnsi="Calibri"/>
-                <w:color w:val="3C3C3C"/>
-                <w:sz w:val="20"/>
-              </w:rPr>
-              <w:t>O maior risco operacional é a resistência das áreas técnicas em tentar converter a transferência simplificada em um convênio tradicional, exigindo exames documentais ex-ante exaustivos. A equipe deve focar estritamente no monitoramento do resultado físico entregue para não paralisar o fluxo célere.</w:t>
+              <w:t>Ele funciona como um simulador (sandbox) isolado, permitindo que as equipes técnicas de estados e municípios simulem a parametrização, adesão, empenho e prestação de contas de forma prática e 100% segura, sem risco de gerar obrigações financeiras reais.</w:t>
             </w:r>
           </w:p>
         </w:tc>
@@ -990,9 +1125,9 @@
         <w:tc>
           <w:tcPr>
             <w:tcW w:type="dxa" w:w="8352"/>
-            <w:shd w:val="clear" w:color="auto" w:fill="FFFDF0"/>
+            <w:shd w:val="clear" w:color="auto" w:fill="F0F9FF"/>
             <w:tcBorders>
-              <w:left w:val="single" w:sz="36" w:space="0" w:color="ffc107"/>
+              <w:left w:val="single" w:sz="36" w:space="0" w:color="0284c7"/>
               <w:top w:val="none"/>
               <w:bottom w:val="none"/>
               <w:right w:val="none"/>
@@ -1012,10 +1147,10 @@
               <w:rPr>
                 <w:rFonts w:ascii="Calibri" w:hAnsi="Calibri"/>
                 <w:b/>
-                <w:color w:val="0B111E"/>
+                <w:color w:val="0F172A"/>
                 <w:sz w:val="21"/>
               </w:rPr>
-              <w:t>Risco 2: Prazos do Defeso Eleitoral Ordinário</w:t>
+              <w:t>❓ Quais são os principais benefícios de uso deste modelo?</w:t>
             </w:r>
           </w:p>
           <w:p>
@@ -1028,7 +1163,7 @@
                 <w:color w:val="3C3C3C"/>
                 <w:sz w:val="20"/>
               </w:rPr>
-              <w:t>Observância rígida das vedações da legislação eleitoral federal. Note que apenas programas finalísticos em caráter de emergência ou calamidade pública decretada (com portaria governamental ativa) possuem prerrogativas e exceções de repasse; políticas comuns ordinárias devem respeitar estritamente o período impeditivo.</w:t>
+              <w:t>Desburocratização extrema (eliminação dos convênios clássicos), celeridade operacional com empenho automático via SIAFI, foco nos resultados físicos entregues em vez de controle processual, e total transparência ativa e rastreabilidade dos recursos federais.</w:t>
             </w:r>
           </w:p>
         </w:tc>
@@ -1042,323 +1177,284 @@
     <w:p>
       <w:pPr>
         <w:keepNext/>
-        <w:spacing w:before="360" w:after="160"/>
+        <w:spacing w:before="320" w:after="160"/>
       </w:pPr>
       <w:r>
         <w:rPr>
           <w:rFonts w:ascii="Calibri" w:hAnsi="Calibri"/>
           <w:b/>
-          <w:color w:val="0B111E"/>
-          <w:sz w:val="30"/>
+          <w:color w:val="0F172A"/>
+          <w:sz w:val="28"/>
         </w:rPr>
-        <w:t>8. Boas Práticas e Recomendações Operacionais</w:t>
+        <w:t>8. Pontos de Atenção e Riscos</w:t>
       </w:r>
     </w:p>
+    <w:tbl>
+      <w:tblPr>
+        <w:tblW w:type="auto" w:w="0"/>
+        <w:jc w:val="center"/>
+        <w:tblLayout w:type="fixed"/>
+        <w:tblLook w:firstColumn="1" w:firstRow="1" w:lastColumn="0" w:lastRow="0" w:noHBand="0" w:noVBand="1" w:val="04A0"/>
+      </w:tblPr>
+      <w:tblGrid>
+        <w:gridCol w:w="9360"/>
+      </w:tblGrid>
+      <w:tr>
+        <w:tc>
+          <w:tcPr>
+            <w:tcW w:type="dxa" w:w="8352"/>
+            <w:shd w:val="clear" w:color="auto" w:fill="FEF2F2"/>
+            <w:tcBorders>
+              <w:left w:val="single" w:sz="36" w:space="0" w:color="ef4444"/>
+              <w:top w:val="none"/>
+              <w:bottom w:val="none"/>
+              <w:right w:val="none"/>
+            </w:tcBorders>
+            <w:tcMar>
+              <w:top w:w="150" w:type="dxa"/>
+              <w:bottom w:w="150" w:type="dxa"/>
+              <w:left w:w="250" w:type="dxa"/>
+              <w:right w:w="200" w:type="dxa"/>
+            </w:tcMar>
+          </w:tcPr>
+          <w:p>
+            <w:pPr>
+              <w:spacing w:before="0" w:after="80"/>
+            </w:pPr>
+            <w:r>
+              <w:rPr>
+                <w:rFonts w:ascii="Calibri" w:hAnsi="Calibri"/>
+                <w:b/>
+                <w:color w:val="0F172A"/>
+                <w:sz w:val="21"/>
+              </w:rPr>
+              <w:t>⚠️ Sintoma do Convênio</w:t>
+            </w:r>
+          </w:p>
+          <w:p>
+            <w:pPr>
+              <w:spacing w:before="80" w:after="80" w:line="276" w:lineRule="auto"/>
+            </w:pPr>
+            <w:r>
+              <w:rPr>
+                <w:rFonts w:ascii="Calibri" w:hAnsi="Calibri"/>
+                <w:color w:val="3C3C3C"/>
+                <w:sz w:val="20"/>
+              </w:rPr>
+              <w:t>Resistência técnica e cultural em desapegar dos procedimentos analíticos tradicionais, exigindo documentos manuais densos que desfiguram a celeridade das Transferências Simplificadas.</w:t>
+            </w:r>
+          </w:p>
+        </w:tc>
+      </w:tr>
+    </w:tbl>
     <w:p>
       <w:pPr>
-        <w:spacing w:before="0" w:after="160" w:line="276" w:lineRule="auto"/>
+        <w:spacing w:before="120" w:after="120"/>
       </w:pPr>
-      <w:r>
-        <w:rPr>
-          <w:rFonts w:ascii="Calibri" w:hAnsi="Calibri"/>
-          <w:color w:val="3C3C3C"/>
-          <w:sz w:val="22"/>
-        </w:rPr>
-        <w:t>• Uso Prévia de Sandbox: Recomenda-se que as equipes utilizem o ambiente de Treinamento (Sandbox) livre, onde 90% das telas estão acessíveis para testes sem risco de geração de obrigações contábeis reais.</w:t>
-      </w:r>
     </w:p>
+    <w:tbl>
+      <w:tblPr>
+        <w:tblW w:type="auto" w:w="0"/>
+        <w:jc w:val="center"/>
+        <w:tblLayout w:type="fixed"/>
+        <w:tblLook w:firstColumn="1" w:firstRow="1" w:lastColumn="0" w:lastRow="0" w:noHBand="0" w:noVBand="1" w:val="04A0"/>
+      </w:tblPr>
+      <w:tblGrid>
+        <w:gridCol w:w="9360"/>
+      </w:tblGrid>
+      <w:tr>
+        <w:tc>
+          <w:tcPr>
+            <w:tcW w:type="dxa" w:w="8352"/>
+            <w:shd w:val="clear" w:color="auto" w:fill="FEF2F2"/>
+            <w:tcBorders>
+              <w:left w:val="single" w:sz="36" w:space="0" w:color="ef4444"/>
+              <w:top w:val="none"/>
+              <w:bottom w:val="none"/>
+              <w:right w:val="none"/>
+            </w:tcBorders>
+            <w:tcMar>
+              <w:top w:w="150" w:type="dxa"/>
+              <w:bottom w:w="150" w:type="dxa"/>
+              <w:left w:w="250" w:type="dxa"/>
+              <w:right w:w="200" w:type="dxa"/>
+            </w:tcMar>
+          </w:tcPr>
+          <w:p>
+            <w:pPr>
+              <w:spacing w:before="0" w:after="80"/>
+            </w:pPr>
+            <w:r>
+              <w:rPr>
+                <w:rFonts w:ascii="Calibri" w:hAnsi="Calibri"/>
+                <w:b/>
+                <w:color w:val="0F172A"/>
+                <w:sz w:val="21"/>
+              </w:rPr>
+              <w:t>⚠️ Defeso Eleitoral Ordinário</w:t>
+            </w:r>
+          </w:p>
+          <w:p>
+            <w:pPr>
+              <w:spacing w:before="80" w:after="80" w:line="276" w:lineRule="auto"/>
+            </w:pPr>
+            <w:r>
+              <w:rPr>
+                <w:rFonts w:ascii="Calibri" w:hAnsi="Calibri"/>
+                <w:color w:val="3C3C3C"/>
+                <w:sz w:val="20"/>
+              </w:rPr>
+              <w:t>Observância rígida de prazos legais. Note que o programa Prévfogo possui exceções normativas regulamentadas por portaria de emergência orçamentária; já programas como o Propatinhas devem respeitar as vedações ordinárias.</w:t>
+            </w:r>
+          </w:p>
+        </w:tc>
+      </w:tr>
+    </w:tbl>
     <w:p>
       <w:pPr>
-        <w:spacing w:before="0" w:after="160" w:line="276" w:lineRule="auto"/>
+        <w:spacing w:before="120" w:after="120"/>
       </w:pPr>
-      <w:r>
-        <w:rPr>
-          <w:rFonts w:ascii="Calibri" w:hAnsi="Calibri"/>
-          <w:color w:val="3C3C3C"/>
-          <w:sz w:val="22"/>
-        </w:rPr>
-        <w:t>• Envolvimento Multidisciplinar: Envolver as equipes técnicas finalísticas desde a fase de simulação no sistema para validar as metas padronizadas e parâmetros cadastrados.</w:t>
-      </w:r>
-    </w:p>
-    <w:p>
-      <w:pPr>
-        <w:spacing w:before="0" w:after="160" w:line="276" w:lineRule="auto"/>
-      </w:pPr>
-      <w:r>
-        <w:rPr>
-          <w:rFonts w:ascii="Calibri" w:hAnsi="Calibri"/>
-          <w:color w:val="3C3C3C"/>
-          <w:sz w:val="22"/>
-        </w:rPr>
-        <w:t>• Canais de Diálogo Permanentes: Manter salas virtuais ou chats ágeis ativos para resolução de dúvidas e homologação de metas com o MGI.</w:t>
-      </w:r>
     </w:p>
     <w:p>
       <w:pPr>
         <w:keepNext/>
-        <w:spacing w:before="360" w:after="160"/>
+        <w:spacing w:before="320" w:after="160"/>
       </w:pPr>
       <w:r>
         <w:rPr>
           <w:rFonts w:ascii="Calibri" w:hAnsi="Calibri"/>
           <w:b/>
-          <w:color w:val="0B111E"/>
-          <w:sz w:val="30"/>
+          <w:color w:val="0F172A"/>
+          <w:sz w:val="28"/>
         </w:rPr>
-        <w:t>9. Glossário Técnico</w:t>
+        <w:t>9. Boas Práticas Operacionais</w:t>
       </w:r>
     </w:p>
+    <w:tbl>
+      <w:tblPr>
+        <w:tblW w:type="auto" w:w="0"/>
+        <w:jc w:val="center"/>
+        <w:tblLayout w:type="fixed"/>
+        <w:tblLook w:firstColumn="1" w:firstRow="1" w:lastColumn="0" w:lastRow="0" w:noHBand="0" w:noVBand="1" w:val="04A0"/>
+      </w:tblPr>
+      <w:tblGrid>
+        <w:gridCol w:w="9360"/>
+      </w:tblGrid>
+      <w:tr>
+        <w:tc>
+          <w:tcPr>
+            <w:tcW w:type="dxa" w:w="8352"/>
+            <w:shd w:val="clear" w:color="auto" w:fill="F0FDF4"/>
+            <w:tcBorders>
+              <w:left w:val="single" w:sz="36" w:space="0" w:color="10b981"/>
+              <w:top w:val="none"/>
+              <w:bottom w:val="none"/>
+              <w:right w:val="none"/>
+            </w:tcBorders>
+            <w:tcMar>
+              <w:top w:w="150" w:type="dxa"/>
+              <w:bottom w:w="150" w:type="dxa"/>
+              <w:left w:w="250" w:type="dxa"/>
+              <w:right w:w="200" w:type="dxa"/>
+            </w:tcMar>
+          </w:tcPr>
+          <w:p>
+            <w:pPr>
+              <w:spacing w:before="0" w:after="80"/>
+            </w:pPr>
+            <w:r>
+              <w:rPr>
+                <w:rFonts w:ascii="Calibri" w:hAnsi="Calibri"/>
+                <w:b/>
+                <w:color w:val="0F172A"/>
+                <w:sz w:val="21"/>
+              </w:rPr>
+              <w:t>✅ Acesso Livre e Sandbox</w:t>
+            </w:r>
+          </w:p>
+          <w:p>
+            <w:pPr>
+              <w:spacing w:before="80" w:after="80" w:line="276" w:lineRule="auto"/>
+            </w:pPr>
+            <w:r>
+              <w:rPr>
+                <w:rFonts w:ascii="Calibri" w:hAnsi="Calibri"/>
+                <w:color w:val="3C3C3C"/>
+                <w:sz w:val="20"/>
+              </w:rPr>
+              <w:t>Utilizar o módulo no ambiente de treinamento sem necessidade de certificado digital imediato para simular 90% das telas e parametrizações sem qualquer risco fiscal.</w:t>
+            </w:r>
+          </w:p>
+        </w:tc>
+      </w:tr>
+    </w:tbl>
     <w:p>
       <w:pPr>
-        <w:spacing w:after="80"/>
+        <w:spacing w:before="120" w:after="120"/>
       </w:pPr>
-      <w:r>
-        <w:rPr>
-          <w:rFonts w:ascii="Calibri" w:hAnsi="Calibri"/>
-          <w:b/>
-          <w:color w:val="0B111E"/>
-          <w:sz w:val="20"/>
-        </w:rPr>
-        <w:t xml:space="preserve">CLÁUSULA SUSPENSIVA: </w:t>
-      </w:r>
-      <w:r>
-        <w:rPr>
-          <w:rFonts w:ascii="Calibri" w:hAnsi="Calibri"/>
-          <w:color w:val="505050"/>
-          <w:sz w:val="20"/>
-        </w:rPr>
-        <w:t>Condição legal que suspende a liberação financeira seguinte até que a meta anterior seja comprovada.</w:t>
-      </w:r>
     </w:p>
+    <w:tbl>
+      <w:tblPr>
+        <w:tblW w:type="auto" w:w="0"/>
+        <w:jc w:val="center"/>
+        <w:tblLayout w:type="fixed"/>
+        <w:tblLook w:firstColumn="1" w:firstRow="1" w:lastColumn="0" w:lastRow="0" w:noHBand="0" w:noVBand="1" w:val="04A0"/>
+      </w:tblPr>
+      <w:tblGrid>
+        <w:gridCol w:w="9360"/>
+      </w:tblGrid>
+      <w:tr>
+        <w:tc>
+          <w:tcPr>
+            <w:tcW w:type="dxa" w:w="8352"/>
+            <w:shd w:val="clear" w:color="auto" w:fill="F0FDF4"/>
+            <w:tcBorders>
+              <w:left w:val="single" w:sz="36" w:space="0" w:color="10b981"/>
+              <w:top w:val="none"/>
+              <w:bottom w:val="none"/>
+              <w:right w:val="none"/>
+            </w:tcBorders>
+            <w:tcMar>
+              <w:top w:w="150" w:type="dxa"/>
+              <w:bottom w:w="150" w:type="dxa"/>
+              <w:left w:w="250" w:type="dxa"/>
+              <w:right w:w="200" w:type="dxa"/>
+            </w:tcMar>
+          </w:tcPr>
+          <w:p>
+            <w:pPr>
+              <w:spacing w:before="0" w:after="80"/>
+            </w:pPr>
+            <w:r>
+              <w:rPr>
+                <w:rFonts w:ascii="Calibri" w:hAnsi="Calibri"/>
+                <w:b/>
+                <w:color w:val="0F172A"/>
+                <w:sz w:val="21"/>
+              </w:rPr>
+              <w:t>✅ Diálogo Técnico Permanente</w:t>
+            </w:r>
+          </w:p>
+          <w:p>
+            <w:pPr>
+              <w:spacing w:before="80" w:after="80" w:line="276" w:lineRule="auto"/>
+            </w:pPr>
+            <w:r>
+              <w:rPr>
+                <w:rFonts w:ascii="Calibri" w:hAnsi="Calibri"/>
+                <w:color w:val="3C3C3C"/>
+                <w:sz w:val="20"/>
+              </w:rPr>
+              <w:t>Centralizar discussões operacionais de parametrização e regras de negócio em fóruns específicos e canais integrados para dirimir dúvidas das equipes executoras com agilidade.</w:t>
+            </w:r>
+          </w:p>
+        </w:tc>
+      </w:tr>
+    </w:tbl>
     <w:p>
       <w:pPr>
-        <w:spacing w:after="80"/>
+        <w:spacing w:before="120" w:after="120"/>
       </w:pPr>
-      <w:r>
-        <w:rPr>
-          <w:rFonts w:ascii="Calibri" w:hAnsi="Calibri"/>
-          <w:b/>
-          <w:color w:val="0B111E"/>
-          <w:sz w:val="20"/>
-        </w:rPr>
-        <w:t xml:space="preserve">ENTE SUB-NACIONAL: </w:t>
-      </w:r>
-      <w:r>
-        <w:rPr>
-          <w:rFonts w:ascii="Calibri" w:hAnsi="Calibri"/>
-          <w:color w:val="505050"/>
-          <w:sz w:val="20"/>
-        </w:rPr>
-        <w:t>Estado, Distrito Federal ou Município beneficiário direto do repasse federal.</w:t>
-      </w:r>
-    </w:p>
-    <w:p>
-      <w:pPr>
-        <w:spacing w:after="80"/>
-      </w:pPr>
-      <w:r>
-        <w:rPr>
-          <w:rFonts w:ascii="Calibri" w:hAnsi="Calibri"/>
-          <w:b/>
-          <w:color w:val="0B111E"/>
-          <w:sz w:val="20"/>
-        </w:rPr>
-        <w:t xml:space="preserve">PARAMETRIZAÇÃO: </w:t>
-      </w:r>
-      <w:r>
-        <w:rPr>
-          <w:rFonts w:ascii="Calibri" w:hAnsi="Calibri"/>
-          <w:color w:val="505050"/>
-          <w:sz w:val="20"/>
-        </w:rPr>
-        <w:t>Configuração das regras de negócio, metas, prazos e anexos de uma política no sistema.</w:t>
-      </w:r>
-    </w:p>
-    <w:p>
-      <w:pPr>
-        <w:spacing w:after="80"/>
-      </w:pPr>
-      <w:r>
-        <w:rPr>
-          <w:rFonts w:ascii="Calibri" w:hAnsi="Calibri"/>
-          <w:b/>
-          <w:color w:val="0B111E"/>
-          <w:sz w:val="20"/>
-        </w:rPr>
-        <w:t xml:space="preserve">RELATÓRIO DE EXECUÇÃO: </w:t>
-      </w:r>
-      <w:r>
-        <w:rPr>
-          <w:rFonts w:ascii="Calibri" w:hAnsi="Calibri"/>
-          <w:color w:val="505050"/>
-          <w:sz w:val="20"/>
-        </w:rPr>
-        <w:t>Documento simplificado para comprovação do cumprimento das metas físicas pactuadas.</w:t>
-      </w:r>
-    </w:p>
-    <w:p>
-      <w:pPr>
-        <w:spacing w:after="80"/>
-      </w:pPr>
-      <w:r>
-        <w:rPr>
-          <w:rFonts w:ascii="Calibri" w:hAnsi="Calibri"/>
-          <w:b/>
-          <w:color w:val="0B111E"/>
-          <w:sz w:val="20"/>
-        </w:rPr>
-        <w:t xml:space="preserve">SIAFI: </w:t>
-      </w:r>
-      <w:r>
-        <w:rPr>
-          <w:rFonts w:ascii="Calibri" w:hAnsi="Calibri"/>
-          <w:color w:val="505050"/>
-          <w:sz w:val="20"/>
-        </w:rPr>
-        <w:t>Sistema Integrado de Administração Financeira do Governo Federal.</w:t>
-      </w:r>
-    </w:p>
-    <w:p>
-      <w:pPr>
-        <w:spacing w:after="80"/>
-      </w:pPr>
-      <w:r>
-        <w:rPr>
-          <w:rFonts w:ascii="Calibri" w:hAnsi="Calibri"/>
-          <w:b/>
-          <w:color w:val="0B111E"/>
-          <w:sz w:val="20"/>
-        </w:rPr>
-        <w:t xml:space="preserve">SIORG: </w:t>
-      </w:r>
-      <w:r>
-        <w:rPr>
-          <w:rFonts w:ascii="Calibri" w:hAnsi="Calibri"/>
-          <w:color w:val="505050"/>
-          <w:sz w:val="20"/>
-        </w:rPr>
-        <w:t>Sistema de Informações Organizacionais do Governo Federal, utilizado para identificar unidades administrativas.</w:t>
-      </w:r>
-    </w:p>
-    <w:p>
-      <w:pPr>
-        <w:spacing w:after="80"/>
-      </w:pPr>
-      <w:r>
-        <w:rPr>
-          <w:rFonts w:ascii="Calibri" w:hAnsi="Calibri"/>
-          <w:b/>
-          <w:color w:val="0B111E"/>
-          <w:sz w:val="20"/>
-        </w:rPr>
-        <w:t xml:space="preserve">TRANSFEREGOV.BR: </w:t>
-      </w:r>
-      <w:r>
-        <w:rPr>
-          <w:rFonts w:ascii="Calibri" w:hAnsi="Calibri"/>
-          <w:color w:val="505050"/>
-          <w:sz w:val="20"/>
-        </w:rPr>
-        <w:t>Plataforma digital integrada da União para a operacionalização e controle das parcerias federais.</w:t>
-      </w:r>
-    </w:p>
-    <w:p>
-      <w:pPr>
-        <w:spacing w:after="80"/>
-      </w:pPr>
-      <w:r>
-        <w:rPr>
-          <w:rFonts w:ascii="Calibri" w:hAnsi="Calibri"/>
-          <w:b/>
-          <w:color w:val="0B111E"/>
-          <w:sz w:val="20"/>
-        </w:rPr>
-        <w:t xml:space="preserve">TRANSFERÊNCIA SIMPLIFICADA: </w:t>
-      </w:r>
-      <w:r>
-        <w:rPr>
-          <w:rFonts w:ascii="Calibri" w:hAnsi="Calibri"/>
-          <w:color w:val="505050"/>
-          <w:sz w:val="20"/>
-        </w:rPr>
-        <w:t>Modalidade de repasse célere baseada em adesão e metas padronizadas, sem convênio tradicional.</w:t>
-      </w:r>
-    </w:p>
-    <w:p>
-      <w:pPr>
-        <w:spacing w:after="80"/>
-      </w:pPr>
-      <w:r>
-        <w:rPr>
-          <w:rFonts w:ascii="Calibri" w:hAnsi="Calibri"/>
-          <w:b/>
-          <w:color w:val="0B111E"/>
-          <w:sz w:val="20"/>
-        </w:rPr>
-        <w:t xml:space="preserve">UNIDADE GESTORA (UG): </w:t>
-      </w:r>
-      <w:r>
-        <w:rPr>
-          <w:rFonts w:ascii="Calibri" w:hAnsi="Calibri"/>
-          <w:color w:val="505050"/>
-          <w:sz w:val="20"/>
-        </w:rPr>
-        <w:t>Unidade orçamentária responsável pela execução financeira dos recursos.</w:t>
-      </w:r>
-    </w:p>
-    <w:p>
-      <w:pPr>
-        <w:keepNext/>
-        <w:spacing w:before="360" w:after="160"/>
-      </w:pPr>
-      <w:r>
-        <w:rPr>
-          <w:rFonts w:ascii="Calibri" w:hAnsi="Calibri"/>
-          <w:b/>
-          <w:color w:val="0B111E"/>
-          <w:sz w:val="30"/>
-        </w:rPr>
-        <w:t>10. Materiais de Apoio e Suporte</w:t>
-      </w:r>
-    </w:p>
-    <w:p>
-      <w:pPr>
-        <w:spacing w:before="0" w:after="160" w:line="276" w:lineRule="auto"/>
-      </w:pPr>
-      <w:r>
-        <w:rPr>
-          <w:rFonts w:ascii="Calibri" w:hAnsi="Calibri"/>
-          <w:color w:val="3C3C3C"/>
-          <w:sz w:val="22"/>
-        </w:rPr>
-        <w:t>• Ambiente de Treinamento: Acesso via ambiente de laboratório para simulação da jornada.</w:t>
-      </w:r>
-    </w:p>
-    <w:p>
-      <w:pPr>
-        <w:spacing w:before="0" w:after="160" w:line="276" w:lineRule="auto"/>
-      </w:pPr>
-      <w:r>
-        <w:rPr>
-          <w:rFonts w:ascii="Calibri" w:hAnsi="Calibri"/>
-          <w:color w:val="3C3C3C"/>
-          <w:sz w:val="22"/>
-        </w:rPr>
-        <w:t>• Tutoriais Virtuais: Guias e roteiros passo a passo de navegação nas telas do Módulo de Gestão de Parcerias.</w:t>
-      </w:r>
-    </w:p>
-    <w:p>
-      <w:pPr>
-        <w:spacing w:before="0" w:after="160" w:line="276" w:lineRule="auto"/>
-      </w:pPr>
-      <w:r>
-        <w:rPr>
-          <w:rFonts w:ascii="Calibri" w:hAnsi="Calibri"/>
-          <w:color w:val="3C3C3C"/>
-          <w:sz w:val="22"/>
-        </w:rPr>
-        <w:t>• Central de Suporte: Canais dedicados de suporte do MGI para dúvidas conceituais e operacionais.</w:t>
-      </w:r>
     </w:p>
     <w:sectPr>
       <w:pgSz w:w="12240" w:h="15840"/>

</xml_diff>

<commit_message>
feat(cartilha): redesign layout to dark theme, add icons and fully generalize content
</commit_message>
<xml_diff>
--- a/landing_transferegov/materiais_complementares/slides/Cartilha_de_Nivelamento_Modulo_de_Gestao_de_Parcerias_e_TRANSFEREGOV.docx
+++ b/landing_transferegov/materiais_complementares/slides/Cartilha_de_Nivelamento_Modulo_de_Gestao_de_Parcerias_e_TRANSFEREGOV.docx
@@ -58,7 +58,7 @@
           <w:color w:val="0F172A"/>
           <w:sz w:val="28"/>
         </w:rPr>
-        <w:t>1. Sumário Executivo</w:t>
+        <w:t>⚡ 1. Sumário Executivo</w:t>
       </w:r>
     </w:p>
     <w:p>
@@ -71,7 +71,7 @@
           <w:color w:val="334155"/>
           <w:sz w:val="21"/>
         </w:rPr>
-        <w:t>A modernização dos repasses de recursos no âmbito federal atinge um marco fundamental com a transição para o modelo de Transferência Simplificada no TRANSFEREGOV. Esta mudança é uma resposta direta à necessidade de conferir celeridade e eficiência à execução de políticas públicas críticas e otimizar as parcerias interfederativas.</w:t>
+        <w:t>A modernização dos repasses de recursos no âmbito federal atinge um marco fundamental com a transição para o modelo de Transferência Simplificada no TRANSFEREGOV.BR. Esta mudança é uma resposta direta à necessidade de conferir celeridade e eficiência à execução de políticas públicas críticas de fomento e parcerias, otimizando o relacionamento interfederativo.</w:t>
       </w:r>
     </w:p>
     <w:tbl>
@@ -126,7 +126,7 @@
                 <w:color w:val="3C3C3C"/>
                 <w:sz w:val="20"/>
               </w:rPr>
-              <w:t>• Ruptura de Paradigma: Dispensa convênios ou instrumentos complexos ex-ante.</w:t>
+              <w:t>• Ruptura de Paradigma: Dispensa convênios ou instrumentos complexos ex-ante, focando no objeto físico.</w:t>
             </w:r>
           </w:p>
           <w:p>
@@ -139,7 +139,7 @@
                 <w:color w:val="3C3C3C"/>
                 <w:sz w:val="20"/>
               </w:rPr>
-              <w:t>• Padronização Técnica: Utiliza metas pré-configuradas no sistema do Módulo de Gestão de Parcerias.</w:t>
+              <w:t>• Padronização Técnica: Utiliza metas físicas pré-configuradas no Módulo de Gestão de Parcerias.</w:t>
             </w:r>
           </w:p>
           <w:p>
@@ -152,7 +152,7 @@
                 <w:color w:val="3C3C3C"/>
                 <w:sz w:val="20"/>
               </w:rPr>
-              <w:t>• Solução de Estrutura Organizacional: Uso do SIORG 267384 (Depto. de Gestão de Fundos) para mapeamento administrativo.</w:t>
+              <w:t>• Mapeamento Estrutural: Uso de SIORG setorial (ex: Departamento Gestor - 267384) para controle administrativo.</w:t>
             </w:r>
           </w:p>
           <w:p>
@@ -165,7 +165,7 @@
                 <w:color w:val="3C3C3C"/>
                 <w:sz w:val="20"/>
               </w:rPr>
-              <w:t>• Gestão de Riscos Diferenciada: Regras de exceção (como defeso eleitoral) parametrizadas por política pública.</w:t>
+              <w:t>• Gestão de Riscos Eficiente: Regras de exceção (como o defeso eleitoral) parametrizadas por tipo de programa no sistema.</w:t>
             </w:r>
           </w:p>
           <w:p>
@@ -178,7 +178,7 @@
                 <w:color w:val="3C3C3C"/>
                 <w:sz w:val="20"/>
               </w:rPr>
-              <w:t>• Rastreabilidade Financeira: Integração com SIAFI para abertura automática de contas bancárias.</w:t>
+              <w:t>• Rastreabilidade Financeira: Integração nativa com SIAFI para abertura de contas e conciliação em tempo real.</w:t>
             </w:r>
           </w:p>
         </w:tc>
@@ -201,7 +201,7 @@
           <w:color w:val="0F172A"/>
           <w:sz w:val="28"/>
         </w:rPr>
-        <w:t>2. Contexto Institucional e Base Normativa</w:t>
+        <w:t>🏛️ 2. Contexto Institucional e Base Normativa</w:t>
       </w:r>
     </w:p>
     <w:p>
@@ -214,7 +214,7 @@
           <w:color w:val="334155"/>
           <w:sz w:val="21"/>
         </w:rPr>
-        <w:t>A implementação desta nova modalidade é sustentada pelo Acordo de Cooperação Técnica (ACT) firmado entre o MGI e os órgãos federais parceiros. Este acordo formaliza o suporte do órgão central para a internalização de políticas finalísticas no ecossistema digital de transferências da União.</w:t>
+        <w:t>A implementação desta nova modalidade é sustentada por Acordos de Cooperação Técnica (ACT) firmados entre o Ministério da Gestão e da Inovação em Serviços Públicos (MGI) e os órgãos federais parceiros. Este acordo formaliza o suporte técnico para a internalização de políticas finalísticas no ecossistema de transferências da União, substituindo a análise documental analítica por uma sistemática de adesão rápida.</w:t>
       </w:r>
     </w:p>
     <w:tbl>
@@ -256,7 +256,7 @@
                 <w:color w:val="0F172A"/>
                 <w:sz w:val="21"/>
               </w:rPr>
-              <w:t>Divisão de Responsabilidades:</w:t>
+              <w:t>Papéis e Responsabilidades:</w:t>
             </w:r>
           </w:p>
           <w:p>
@@ -269,7 +269,7 @@
                 <w:color w:val="3C3C3C"/>
                 <w:sz w:val="20"/>
               </w:rPr>
-              <w:t>Papel do MGI: Gestor central da Plataforma TRANSFEREGOV, provedor da infraestrutura técnica e do marco regulatório. Assegura conformidade legal e governança sistêmica.</w:t>
+              <w:t>Papel do MGI: Gestor central da Plataforma TRANSFEREGOV.BR, responsável por fornecer a infraestrutura sistêmica e garantir o marco regulatório e governança.</w:t>
             </w:r>
           </w:p>
           <w:p>
@@ -282,7 +282,7 @@
                 <w:color w:val="3C3C3C"/>
                 <w:sz w:val="20"/>
               </w:rPr>
-              <w:t>Papel dos Órgãos Parceiros: Autonomia total na gestão dos recursos de seus fundos, na definição das regras de negócio de suas políticas finalísticas e homologação de metas.</w:t>
+              <w:t>Papel dos Órgãos Parceiros: Detêm total autonomia na gestão dos recursos de seus fundos, na definição das regras de negócio de suas chamadas públicas e na validação das metas físicas pactuadas.</w:t>
             </w:r>
           </w:p>
         </w:tc>
@@ -305,7 +305,7 @@
           <w:color w:val="0F172A"/>
           <w:sz w:val="28"/>
         </w:rPr>
-        <w:t>3. Arquitetura Técnica do TRANSFEREGOV</w:t>
+        <w:t>⚙️ 3. Arquitetura Técnica do TRANSFEREGOV.BR</w:t>
       </w:r>
     </w:p>
     <w:p>
@@ -318,7 +318,7 @@
           <w:color w:val="334155"/>
           <w:sz w:val="21"/>
         </w:rPr>
-        <w:t>A robustez sistêmica do TRANSFEREGOV assegura a integridade dos recursos. A arquitetura de desenvolvimento e execução é subdividida em três ambientes bem definidos:</w:t>
+        <w:t>A robustez do TRANSFEREGOV.BR garante a integridade dos recursos federais. A arquitetura sistêmica é subdividida em três ambientes principais:</w:t>
       </w:r>
     </w:p>
     <w:tbl>
@@ -346,7 +346,6 @@
               <w:rPr>
                 <w:b/>
                 <w:color w:val="FFFFFF"/>
-                <w:sz w:val="20"/>
               </w:rPr>
               <w:t>Ambiente</w:t>
             </w:r>
@@ -365,7 +364,6 @@
               <w:rPr>
                 <w:b/>
                 <w:color w:val="FFFFFF"/>
-                <w:sz w:val="20"/>
               </w:rPr>
               <w:t>Descrição e Finalidade</w:t>
             </w:r>
@@ -396,14 +394,11 @@
             <w:tcW w:type="dxa" w:w="4680"/>
           </w:tcPr>
           <w:p>
-            <w:pPr>
-              <w:jc w:val="left"/>
-            </w:pPr>
             <w:r>
               <w:rPr>
                 <w:sz w:val="19"/>
               </w:rPr>
-              <w:t>Simulação e sandbox para capacitação de técnicos locais sem risco fiscal ou transações reais.</w:t>
+              <w:t>Simulador (sandbox) isolado destinado ao aprendizado das equipes técnicas, sem impacto orçamentário real.</w:t>
             </w:r>
           </w:p>
         </w:tc>
@@ -432,14 +427,11 @@
             <w:tcW w:type="dxa" w:w="4680"/>
           </w:tcPr>
           <w:p>
-            <w:pPr>
-              <w:jc w:val="left"/>
-            </w:pPr>
             <w:r>
               <w:rPr>
                 <w:sz w:val="19"/>
               </w:rPr>
-              <w:t>Testes de integração bancária via API e validações finais de layouts antes da implantação.</w:t>
+              <w:t>Validações finais de layouts, parametrizações e testes de integração de APIs com agentes bancários.</w:t>
             </w:r>
           </w:p>
         </w:tc>
@@ -468,14 +460,11 @@
             <w:tcW w:type="dxa" w:w="4680"/>
           </w:tcPr>
           <w:p>
-            <w:pPr>
-              <w:jc w:val="left"/>
-            </w:pPr>
             <w:r>
               <w:rPr>
                 <w:sz w:val="19"/>
               </w:rPr>
-              <w:t>Execução oficial e jurídica. Repasses efetivos, empenhos e monitoramento de metas.</w:t>
+              <w:t>Execução oficial das parcerias, com empenho no SIAFI, transações financeiras reais e monitoramento legal.</w:t>
             </w:r>
           </w:p>
         </w:tc>
@@ -496,7 +485,7 @@
           <w:color w:val="334155"/>
           <w:sz w:val="21"/>
         </w:rPr>
-        <w:t>Solução Técnica SIORG: Para contornar eventuais ausências de um código de Unidade Gestora próprio, a arquitetura utiliza o SIORG do Departamento de Gestão de Fundos e de Recursos Externos (267384).</w:t>
+        <w:t>Solução Técnica SIORG: Para viabilizar a vinculação administrativa de conselhos ou fundos finalísticos sem código de Unidade Gestora própria, a plataforma utiliza a vinculação via código de SIORG (ex: código do Departamento Gestor de Recursos - 267384) e perfis específicos para servidores.</w:t>
       </w:r>
     </w:p>
     <w:p>
@@ -511,7 +500,7 @@
           <w:color w:val="0F172A"/>
           <w:sz w:val="28"/>
         </w:rPr>
-        <w:t>4. Parametrização por Política Pública</w:t>
+        <w:t>🔧 4. Parametrização por Política Pública</w:t>
       </w:r>
     </w:p>
     <w:p>
@@ -524,7 +513,7 @@
           <w:color w:val="334155"/>
           <w:sz w:val="21"/>
         </w:rPr>
-        <w:t>O Módulo de Gestão de Parcerias do TRANSFEREGOV adapta-se às particularidades das diversas políticas públicas por meio de parametrização no sistema:</w:t>
+        <w:t>O Módulo de Gestão de Parcerias do TRANSFEREGOV.BR se adapta às particularidades de diferentes políticas públicas por meio de configurações no sistema:</w:t>
       </w:r>
     </w:p>
     <w:p>
@@ -552,7 +541,7 @@
           <w:color w:val="334155"/>
           <w:sz w:val="21"/>
         </w:rPr>
-        <w:t>Configuração automatizada de critérios fiscais, jurídicos e técnicos que os entes devem cumprir eletronicamente.</w:t>
+        <w:t>Definição automatizada de critérios técnicos e fiscais que os proponentes devem cumprir eletronicamente.</w:t>
       </w:r>
     </w:p>
     <w:p>
@@ -567,7 +556,7 @@
           <w:color w:val="0369A1"/>
           <w:sz w:val="23"/>
         </w:rPr>
-        <w:t>2. Anexos e Documentos Customizados</w:t>
+        <w:t>2. Anexos Obrigatórios</w:t>
       </w:r>
     </w:p>
     <w:p>
@@ -580,7 +569,7 @@
           <w:color w:val="334155"/>
           <w:sz w:val="21"/>
         </w:rPr>
-        <w:t>Possibilidade de limitar a adesão apenas a proponentes que anexarem planos setoriais específicos (ex: planos de contingência, declarações clínicas).</w:t>
+        <w:t>Possibilidade de restringir a adesão à inserção de planos setoriais específicos de trabalho (ex: planos de contingência, declarações locais).</w:t>
       </w:r>
     </w:p>
     <w:p>
@@ -608,7 +597,7 @@
           <w:color w:val="334155"/>
           <w:sz w:val="21"/>
         </w:rPr>
-        <w:t>Conjunto de objetivos de entrega física e quantificável pré-configurados para a rápida adesão dos estados e municípios.</w:t>
+        <w:t>Catálogo de entregas físicas predefinidas para a rápida adesão dos estados e municípios, eliminando propostas subjetivas.</w:t>
       </w:r>
     </w:p>
     <w:p>
@@ -623,7 +612,7 @@
           <w:color w:val="0F172A"/>
           <w:sz w:val="28"/>
         </w:rPr>
-        <w:t>5. Ordem de Pagamento de Parcerias (OPP)</w:t>
+        <w:t>💳 5. Ordem de Pagamento de Parcerias (OPP)</w:t>
       </w:r>
     </w:p>
     <w:p>
@@ -636,7 +625,7 @@
           <w:color w:val="334155"/>
           <w:sz w:val="21"/>
         </w:rPr>
-        <w:t>A Ordem de Pagamento de Parcerias (OPP) representa a automação definitiva do ciclo de execução financeira no Módulo de Gestão de Parcerias do TRANSFEREGOV. Ela desburocratiza e assegura o fluxo de recursos públicos federais:</w:t>
+        <w:t>A OPP é o instrumento financeiro definitivo de automatização bancária das parcerias. Ela assegura e agiliza a liberação dos recursos federais:</w:t>
       </w:r>
     </w:p>
     <w:p>
@@ -664,7 +653,7 @@
           <w:color w:val="334155"/>
           <w:sz w:val="21"/>
         </w:rPr>
-        <w:t>Integração nativa com BB, Caixa e BNB, eliminando o processamento em lote (batch).</w:t>
+        <w:t>Conexão direta com bancos públicos oficiais, eliminando o processamento em lote (batch).</w:t>
       </w:r>
     </w:p>
     <w:p>
@@ -692,7 +681,7 @@
           <w:color w:val="334155"/>
           <w:sz w:val="21"/>
         </w:rPr>
-        <w:t>Assinatura eletrônica em dupla autenticação (Operador/Gestor) via Gov.br Ouro.</w:t>
+        <w:t>Exigência de dupla autorização eletrônica (Operador e Gestor) com certificação Gov.br Ouro.</w:t>
       </w:r>
     </w:p>
     <w:p>
@@ -720,7 +709,7 @@
           <w:color w:val="334155"/>
           <w:sz w:val="21"/>
         </w:rPr>
-        <w:t>Quitação direta de fornecedores locais na ponta sem saques intermediários.</w:t>
+        <w:t>Pagamento direto a fornecedores e prestadores na ponta, garantindo conciliação imediata.</w:t>
       </w:r>
     </w:p>
     <w:p>
@@ -748,7 +737,7 @@
           <w:color w:val="334155"/>
           <w:sz w:val="21"/>
         </w:rPr>
-        <w:t>Bloqueio e desbloqueio remoto de contas bancárias pelo órgão concedente.</w:t>
+        <w:t>Prerrogativa do órgão federal de comandar o bloqueio e devolução de saldos não utilizados.</w:t>
       </w:r>
     </w:p>
     <w:tbl>
@@ -790,7 +779,7 @@
                 <w:color w:val="0F172A"/>
                 <w:sz w:val="21"/>
               </w:rPr>
-              <w:t>Ficha Técnica Operacional:</w:t>
+              <w:t>Ficha Técnica e Prazos:</w:t>
             </w:r>
           </w:p>
           <w:p>
@@ -803,7 +792,7 @@
                 <w:color w:val="3C3C3C"/>
                 <w:sz w:val="20"/>
               </w:rPr>
-              <w:t>Ficha Técnica e Prazos: Abertura de conta via API bancária em 3 a 5 segundos; Janela de operação das 07h às 19h30; transações via Pix sem teto de valor.</w:t>
+              <w:t>Ficha Técnica e Prazos: Abertura de conta via API em 3 a 5 segundos; Janela de autorizações das 07h às 19h30; transações via Pix sem teto de valor. A migração compulsória para todas as 63 mil contas ativas no país deve ocorrer até dezembro de 2026.</w:t>
             </w:r>
           </w:p>
         </w:tc>
@@ -826,7 +815,7 @@
           <w:color w:val="0F172A"/>
           <w:sz w:val="28"/>
         </w:rPr>
-        <w:t>6. Jornada da Transferência</w:t>
+        <w:t>🗺️ 6. Jornada da Transferência</w:t>
       </w:r>
     </w:p>
     <w:p>
@@ -839,7 +828,7 @@
           <w:color w:val="334155"/>
           <w:sz w:val="21"/>
         </w:rPr>
-        <w:t>O fluxo lógico simplificado é estruturado em etapas claras que substituem a burocracia documental tradicional por validações diretas:</w:t>
+        <w:t>A jornada de repasses simplificados substitui os planos de trabalho densos por um fluxo lógico em 5 etapas no sistema:</w:t>
       </w:r>
     </w:p>
     <w:p>
@@ -852,7 +841,7 @@
           <w:color w:val="334155"/>
           <w:sz w:val="21"/>
         </w:rPr>
-        <w:t>• 01. Convocatória: Cadastro das regras e metas no sistema pelo órgão concedente.</w:t>
+        <w:t>• 01. Convocatória: O órgão concedente cadastra a chamada pública, metas físicas padronizadas e prazos no sistema.</w:t>
       </w:r>
     </w:p>
     <w:p>
@@ -865,7 +854,7 @@
           <w:color w:val="334155"/>
           <w:sz w:val="21"/>
         </w:rPr>
-        <w:t>• 02. Manifestação de Interesse: Adesão digital rápida e sem burocracia pelo ente parceiro.</w:t>
+        <w:t>• 02. Proposição: O ente subnacional adere digitalmente à chamada, preenchendo as informações e anexando os documentos.</w:t>
       </w:r>
     </w:p>
     <w:p>
@@ -878,7 +867,7 @@
           <w:color w:val="334155"/>
           <w:sz w:val="21"/>
         </w:rPr>
-        <w:t>• 03. Validação Técnica: Avaliação expedita e verificação dos critérios automatizados.</w:t>
+        <w:t>• 03. Validação: O concedente realiza a análise da habilitação eletrônica e emite o parecer de aprovação.</w:t>
       </w:r>
     </w:p>
     <w:p>
@@ -891,7 +880,7 @@
           <w:color w:val="334155"/>
           <w:sz w:val="21"/>
         </w:rPr>
-        <w:t>• 04. Empenho e Desembolso: Abertura automática de conta e execução via SIAFI.</w:t>
+        <w:t>• 04. SIAFI: O sistema realiza o empenho automático e o comando de abertura de conta bancária vinculada.</w:t>
       </w:r>
     </w:p>
     <w:p>
@@ -904,7 +893,7 @@
           <w:color w:val="334155"/>
           <w:sz w:val="21"/>
         </w:rPr>
-        <w:t>• 05. Execução e Monitoramento: Comprovação das metas físicas no próprio TRANSFEREGOV.</w:t>
+        <w:t>• 05. Ciclo Final: O ente executa as metas físicas e apresenta o Relatório de Execução Simplificado focado nas entregas.</w:t>
       </w:r>
     </w:p>
     <w:p>
@@ -919,7 +908,7 @@
           <w:color w:val="0F172A"/>
           <w:sz w:val="28"/>
         </w:rPr>
-        <w:t>7. Dúvidas Operacionais (FAQ)</w:t>
+        <w:t>❓ 7. Dúvidas Operacionais (FAQ)</w:t>
       </w:r>
     </w:p>
     <w:tbl>
@@ -961,7 +950,7 @@
                 <w:color w:val="0F172A"/>
                 <w:sz w:val="21"/>
               </w:rPr>
-              <w:t>❓ Como funciona o processo de adesão ao Módulo de Gestão de Parcerias no TRANSFEREGOV?</w:t>
+              <w:t>❓ Como funciona a adesão no TRANSFEREGOV.BR?</w:t>
             </w:r>
           </w:p>
           <w:p>
@@ -974,7 +963,7 @@
                 <w:color w:val="3C3C3C"/>
                 <w:sz w:val="20"/>
               </w:rPr>
-              <w:t>O processo de adesão é 100% eletrônico. O Ente federado (Estado ou Município) localiza a chamada pública de seu interesse no TRANSFEREGOV e manifesta interesse aderindo diretamente pelo sistema, preenchendo as informações solicitadas e assinando digitalmente o termo.</w:t>
+              <w:t>O processo é eletrônico e integrado. O proponente localiza o edital e manifesta interesse aderindo diretamente no TRANSFEREGOV.BR, assinando digitalmente o termo.</w:t>
             </w:r>
           </w:p>
         </w:tc>
@@ -1037,7 +1026,7 @@
                 <w:color w:val="3C3C3C"/>
                 <w:sz w:val="20"/>
               </w:rPr>
-              <w:t>É a flexibilidade dada aos órgãos federais concedentes para predefinir as regras de negócio, metas padronizadas e documentos obrigatórios para cada programa finalístico de repasse, adaptando o sistema às demandas específicas de cada setor.</w:t>
+              <w:t>É a predefinição pelo órgão concedente das regras de negócio, metas padronizadas e documentos exigidos, adaptando o sistema ao seu setor.</w:t>
             </w:r>
           </w:p>
         </w:tc>
@@ -1087,7 +1076,7 @@
                 <w:color w:val="0F172A"/>
                 <w:sz w:val="21"/>
               </w:rPr>
-              <w:t>❓ Qual o papel do ambiente de Treinamento?</w:t>
+              <w:t>❓ Qual a importância do ambiente de Treinamento?</w:t>
             </w:r>
           </w:p>
           <w:p>
@@ -1100,7 +1089,7 @@
                 <w:color w:val="3C3C3C"/>
                 <w:sz w:val="20"/>
               </w:rPr>
-              <w:t>Ele funciona como um simulador (sandbox) isolado, permitindo que as equipes técnicas de estados e municípios simulem a parametrização, adesão, empenho e prestação de contas de forma prática e 100% segura, sem risco de gerar obrigações financeiras reais.</w:t>
+              <w:t>Funciona como um simulador (sandbox) isolado, permitindo que os técnicos simulem a parametrização e execução de forma prática e sem risco fiscal.</w:t>
             </w:r>
           </w:p>
         </w:tc>
@@ -1150,7 +1139,7 @@
                 <w:color w:val="0F172A"/>
                 <w:sz w:val="21"/>
               </w:rPr>
-              <w:t>❓ Quais são os principais benefícios de uso deste modelo?</w:t>
+              <w:t>❓ Como ocorre a prestação de contas?</w:t>
             </w:r>
           </w:p>
           <w:p>
@@ -1163,7 +1152,7 @@
                 <w:color w:val="3C3C3C"/>
                 <w:sz w:val="20"/>
               </w:rPr>
-              <w:t>Desburocratização extrema (eliminação dos convênios clássicos), celeridade operacional com empenho automático via SIAFI, foco nos resultados físicos entregues em vez de controle processual, e total transparência ativa e rastreabilidade dos recursos federais.</w:t>
+              <w:t>O foco é direcionado para a comprovação física do alcance do objeto e das metas cadastradas, simplificando a prestação documental ex-post.</w:t>
             </w:r>
           </w:p>
         </w:tc>
@@ -1186,7 +1175,7 @@
           <w:color w:val="0F172A"/>
           <w:sz w:val="28"/>
         </w:rPr>
-        <w:t>8. Pontos de Atenção e Riscos</w:t>
+        <w:t>⚠️ 8. Pontos de Atenção e Riscos</w:t>
       </w:r>
     </w:p>
     <w:tbl>
@@ -1228,7 +1217,7 @@
                 <w:color w:val="0F172A"/>
                 <w:sz w:val="21"/>
               </w:rPr>
-              <w:t>⚠️ Sintoma do Convênio</w:t>
+              <w:t>⚠️ Sintoma do Convênio (Resistência)</w:t>
             </w:r>
           </w:p>
           <w:p>
@@ -1241,7 +1230,7 @@
                 <w:color w:val="3C3C3C"/>
                 <w:sz w:val="20"/>
               </w:rPr>
-              <w:t>Resistência técnica e cultural em desapegar dos procedimentos analíticos tradicionais, exigindo documentos manuais densos que desfiguram a celeridade das Transferências Simplificadas.</w:t>
+              <w:t>Dificuldade cultural de técnicos em desapegar de controles ex-ante densos e Notas Fiscais unitárias ex-ante, o que invalida a celeridade proposta pela Transferência Simplificada.</w:t>
             </w:r>
           </w:p>
         </w:tc>
@@ -1291,7 +1280,7 @@
                 <w:color w:val="0F172A"/>
                 <w:sz w:val="21"/>
               </w:rPr>
-              <w:t>⚠️ Defeso Eleitoral Ordinário</w:t>
+              <w:t>⚠️ Prazos do Defeso Eleitoral</w:t>
             </w:r>
           </w:p>
           <w:p>
@@ -1304,7 +1293,7 @@
                 <w:color w:val="3C3C3C"/>
                 <w:sz w:val="20"/>
               </w:rPr>
-              <w:t>Observância rígida de prazos legais. Note que o programa Prévfogo possui exceções normativas regulamentadas por portaria de emergência orçamentária; já programas como o Propatinhas devem respeitar as vedações ordinárias.</w:t>
+              <w:t>Observância estrita do calendário eleitoral ordinário. Importante notar que apenas programas finalísticos de caráter de Emergência ou Calamidade Pública formalmente decretada possuem prerrogativas excepcionais de repasse.</w:t>
             </w:r>
           </w:p>
         </w:tc>
@@ -1327,7 +1316,7 @@
           <w:color w:val="0F172A"/>
           <w:sz w:val="28"/>
         </w:rPr>
-        <w:t>9. Boas Práticas Operacionais</w:t>
+        <w:t>✅ 9. Boas Práticas Operacionais</w:t>
       </w:r>
     </w:p>
     <w:tbl>
@@ -1369,7 +1358,7 @@
                 <w:color w:val="0F172A"/>
                 <w:sz w:val="21"/>
               </w:rPr>
-              <w:t>✅ Acesso Livre e Sandbox</w:t>
+              <w:t>✅ Treinamento Prévio em Sandbox</w:t>
             </w:r>
           </w:p>
           <w:p>
@@ -1382,7 +1371,7 @@
                 <w:color w:val="3C3C3C"/>
                 <w:sz w:val="20"/>
               </w:rPr>
-              <w:t>Utilizar o módulo no ambiente de treinamento sem necessidade de certificado digital imediato para simular 90% das telas e parametrizações sem qualquer risco fiscal.</w:t>
+              <w:t>Utilização intensiva do ambiente de treinamento livre para simular 90% das telas sem necessidade imediata de certificado digital.</w:t>
             </w:r>
           </w:p>
         </w:tc>
@@ -1432,7 +1421,7 @@
                 <w:color w:val="0F172A"/>
                 <w:sz w:val="21"/>
               </w:rPr>
-              <w:t>✅ Diálogo Técnico Permanente</w:t>
+              <w:t>✅ Canais de Comunicação Permanentes</w:t>
             </w:r>
           </w:p>
           <w:p>
@@ -1445,7 +1434,7 @@
                 <w:color w:val="3C3C3C"/>
                 <w:sz w:val="20"/>
               </w:rPr>
-              <w:t>Centralizar discussões operacionais de parametrização e regras de negócio em fóruns específicos e canais integrados para dirimir dúvidas das equipes executoras com agilidade.</w:t>
+              <w:t>Abertura de chats técnicos ou fóruns integrados para esclarecer parametrizações de metas com o órgão concedente antes de abrir o edital.</w:t>
             </w:r>
           </w:p>
         </w:tc>

</xml_diff>

<commit_message>
feat: redesign Cartilha to Gov.br Design System & add 30-day drift check
</commit_message>
<xml_diff>
--- a/landing_transferegov/materiais_complementares/slides/Cartilha_de_Nivelamento_Modulo_de_Gestao_de_Parcerias_e_TRANSFEREGOV.docx
+++ b/landing_transferegov/materiais_complementares/slides/Cartilha_de_Nivelamento_Modulo_de_Gestao_de_Parcerias_e_TRANSFEREGOV.docx
@@ -4,15 +4,30 @@
   <w:body>
     <w:p>
       <w:pPr>
-        <w:spacing w:before="480" w:after="160"/>
         <w:jc w:val="center"/>
       </w:pPr>
       <w:r>
         <w:rPr>
-          <w:rFonts w:ascii="Calibri" w:hAnsi="Calibri"/>
+          <w:rFonts w:ascii="Verdana" w:hAnsi="Verdana"/>
+          <w:color w:val="475569"/>
+          <w:sz w:val="22"/>
+        </w:rPr>
+        <w:t>Ministério da Gestão e da Inovação em Serviços Públicos</w:t>
+        <w:br/>
+        <w:t>Secretaria de Gestão e Inovação - SEGES</w:t>
+      </w:r>
+    </w:p>
+    <w:p>
+      <w:pPr>
+        <w:spacing w:before="2400" w:after="160"/>
+        <w:jc w:val="center"/>
+      </w:pPr>
+      <w:r>
+        <w:rPr>
+          <w:rFonts w:ascii="Verdana" w:hAnsi="Verdana"/>
           <w:b/>
-          <w:color w:val="0284C7"/>
-          <w:sz w:val="44"/>
+          <w:color w:val="2670E8"/>
+          <w:sz w:val="48"/>
         </w:rPr>
         <w:t>CARTILHA DE NIVELAMENTO</w:t>
       </w:r>
@@ -24,9 +39,9 @@
       </w:pPr>
       <w:r>
         <w:rPr>
-          <w:rFonts w:ascii="Calibri" w:hAnsi="Calibri"/>
+          <w:rFonts w:ascii="Verdana" w:hAnsi="Verdana"/>
           <w:i/>
-          <w:color w:val="0EA5E9"/>
+          <w:color w:val="475569"/>
           <w:sz w:val="24"/>
         </w:rPr>
         <w:t>Módulo de Gestão de Parcerias e Ecossistema TRANSFEREGOV.BR</w:t>
@@ -36,14 +51,92 @@
     </w:p>
     <w:p>
       <w:pPr>
-        <w:spacing w:after="480"/>
+        <w:spacing w:before="2800"/>
         <w:jc w:val="center"/>
       </w:pPr>
       <w:r>
         <w:rPr>
-          <w:color w:val="E2E8F0"/>
+          <w:rFonts w:ascii="Verdana" w:hAnsi="Verdana"/>
+          <w:color w:val="64748B"/>
+          <w:sz w:val="20"/>
         </w:rPr>
-        <w:t>____________________________________________________</w:t>
+        <w:t>Brasília - DF, 2026</w:t>
+      </w:r>
+    </w:p>
+    <w:p>
+      <w:r>
+        <w:br w:type="page"/>
+      </w:r>
+    </w:p>
+    <w:p>
+      <w:pPr>
+        <w:spacing w:before="360" w:after="240"/>
+      </w:pPr>
+      <w:r>
+        <w:rPr>
+          <w:rFonts w:ascii="Verdana" w:hAnsi="Verdana"/>
+          <w:b/>
+          <w:color w:val="0F172A"/>
+          <w:sz w:val="32"/>
+        </w:rPr>
+        <w:t>Expediente e Ficha Técnica</w:t>
+      </w:r>
+    </w:p>
+    <w:p>
+      <w:pPr>
+        <w:spacing w:after="160" w:line="276" w:lineRule="auto"/>
+      </w:pPr>
+      <w:r>
+        <w:rPr>
+          <w:rFonts w:ascii="Verdana" w:hAnsi="Verdana"/>
+          <w:color w:val="334155"/>
+          <w:sz w:val="21"/>
+        </w:rPr>
+        <w:t>Coordenação Geral: Secretaria de Gestão e Inovação (SEGES) / MGI</w:t>
+      </w:r>
+    </w:p>
+    <w:p>
+      <w:pPr>
+        <w:spacing w:after="160" w:line="276" w:lineRule="auto"/>
+      </w:pPr>
+      <w:r>
+        <w:rPr>
+          <w:rFonts w:ascii="Verdana" w:hAnsi="Verdana"/>
+          <w:color w:val="334155"/>
+          <w:sz w:val="21"/>
+        </w:rPr>
+        <w:t>Desenvolvimento Técnico: Equipe de Capacitação da Rede de Parcerias</w:t>
+      </w:r>
+    </w:p>
+    <w:p>
+      <w:pPr>
+        <w:spacing w:after="160" w:line="276" w:lineRule="auto"/>
+      </w:pPr>
+      <w:r>
+        <w:rPr>
+          <w:rFonts w:ascii="Verdana" w:hAnsi="Verdana"/>
+          <w:color w:val="334155"/>
+          <w:sz w:val="21"/>
+        </w:rPr>
+        <w:t>Design e Acessibilidade: Diretoria de Tecnologia e Informações Operacionais</w:t>
+      </w:r>
+    </w:p>
+    <w:p>
+      <w:pPr>
+        <w:spacing w:after="160" w:line="276" w:lineRule="auto"/>
+      </w:pPr>
+      <w:r>
+        <w:rPr>
+          <w:rFonts w:ascii="Verdana" w:hAnsi="Verdana"/>
+          <w:color w:val="334155"/>
+          <w:sz w:val="21"/>
+        </w:rPr>
+        <w:t>Parceiros Institucionais: Estados, Municípios e Organizações da Sociedade Civil (OSCs)</w:t>
+      </w:r>
+    </w:p>
+    <w:p>
+      <w:r>
+        <w:br w:type="page"/>
       </w:r>
     </w:p>
     <w:p>
@@ -53,12 +146,12 @@
       </w:pPr>
       <w:r>
         <w:rPr>
-          <w:rFonts w:ascii="Calibri" w:hAnsi="Calibri"/>
+          <w:rFonts w:ascii="Verdana" w:hAnsi="Verdana"/>
           <w:b/>
           <w:color w:val="0F172A"/>
           <w:sz w:val="28"/>
         </w:rPr>
-        <w:t>⚡ 1. Sumário Executivo</w:t>
+        <w:t>⚡ Sumário Executivo</w:t>
       </w:r>
     </w:p>
     <w:p>
@@ -67,9 +160,9 @@
       </w:pPr>
       <w:r>
         <w:rPr>
-          <w:rFonts w:ascii="Calibri" w:hAnsi="Calibri"/>
+          <w:rFonts w:ascii="Verdana" w:hAnsi="Verdana"/>
           <w:color w:val="334155"/>
-          <w:sz w:val="21"/>
+          <w:sz w:val="20"/>
         </w:rPr>
         <w:t>A modernização dos repasses de recursos no âmbito federal atinge um marco fundamental com a transição para o modelo de Transferência Simplificada no TRANSFEREGOV.BR. Esta mudança é uma resposta direta à necessidade de conferir celeridade e eficiência à execução de políticas públicas críticas de fomento e parcerias, otimizando o relacionamento interfederativo.</w:t>
       </w:r>
@@ -88,9 +181,9 @@
         <w:tc>
           <w:tcPr>
             <w:tcW w:type="dxa" w:w="8352"/>
-            <w:shd w:val="clear" w:color="auto" w:fill="F0F9FF"/>
+            <w:shd w:val="clear" w:color="auto" w:fill="F0F6FF"/>
             <w:tcBorders>
-              <w:left w:val="single" w:sz="36" w:space="0" w:color="0ea5e9"/>
+              <w:left w:val="single" w:sz="36" w:space="0" w:color="2670E8"/>
               <w:top w:val="none"/>
               <w:bottom w:val="none"/>
               <w:right w:val="none"/>
@@ -108,12 +201,12 @@
             </w:pPr>
             <w:r>
               <w:rPr>
-                <w:rFonts w:ascii="Calibri" w:hAnsi="Calibri"/>
+                <w:rFonts w:ascii="Verdana" w:hAnsi="Verdana"/>
                 <w:b/>
                 <w:color w:val="0F172A"/>
                 <w:sz w:val="21"/>
               </w:rPr>
-              <w:t>Principais Conclusões:</w:t>
+              <w:t>Importante — Principais Conclusões:</w:t>
             </w:r>
           </w:p>
           <w:p>
@@ -122,7 +215,7 @@
             </w:pPr>
             <w:r>
               <w:rPr>
-                <w:rFonts w:ascii="Calibri" w:hAnsi="Calibri"/>
+                <w:rFonts w:ascii="Verdana" w:hAnsi="Verdana"/>
                 <w:color w:val="3C3C3C"/>
                 <w:sz w:val="20"/>
               </w:rPr>
@@ -135,7 +228,7 @@
             </w:pPr>
             <w:r>
               <w:rPr>
-                <w:rFonts w:ascii="Calibri" w:hAnsi="Calibri"/>
+                <w:rFonts w:ascii="Verdana" w:hAnsi="Verdana"/>
                 <w:color w:val="3C3C3C"/>
                 <w:sz w:val="20"/>
               </w:rPr>
@@ -148,7 +241,7 @@
             </w:pPr>
             <w:r>
               <w:rPr>
-                <w:rFonts w:ascii="Calibri" w:hAnsi="Calibri"/>
+                <w:rFonts w:ascii="Verdana" w:hAnsi="Verdana"/>
                 <w:color w:val="3C3C3C"/>
                 <w:sz w:val="20"/>
               </w:rPr>
@@ -161,7 +254,7 @@
             </w:pPr>
             <w:r>
               <w:rPr>
-                <w:rFonts w:ascii="Calibri" w:hAnsi="Calibri"/>
+                <w:rFonts w:ascii="Verdana" w:hAnsi="Verdana"/>
                 <w:color w:val="3C3C3C"/>
                 <w:sz w:val="20"/>
               </w:rPr>
@@ -174,7 +267,7 @@
             </w:pPr>
             <w:r>
               <w:rPr>
-                <w:rFonts w:ascii="Calibri" w:hAnsi="Calibri"/>
+                <w:rFonts w:ascii="Verdana" w:hAnsi="Verdana"/>
                 <w:color w:val="3C3C3C"/>
                 <w:sz w:val="20"/>
               </w:rPr>
@@ -196,12 +289,12 @@
       </w:pPr>
       <w:r>
         <w:rPr>
-          <w:rFonts w:ascii="Calibri" w:hAnsi="Calibri"/>
+          <w:rFonts w:ascii="Verdana" w:hAnsi="Verdana"/>
           <w:b/>
           <w:color w:val="0F172A"/>
           <w:sz w:val="28"/>
         </w:rPr>
-        <w:t>🏛️ 2. Contexto Institucional e Base Normativa</w:t>
+        <w:t>🏛️ Contexto Institucional e Base Normativa</w:t>
       </w:r>
     </w:p>
     <w:p>
@@ -210,9 +303,9 @@
       </w:pPr>
       <w:r>
         <w:rPr>
-          <w:rFonts w:ascii="Calibri" w:hAnsi="Calibri"/>
+          <w:rFonts w:ascii="Verdana" w:hAnsi="Verdana"/>
           <w:color w:val="334155"/>
-          <w:sz w:val="21"/>
+          <w:sz w:val="20"/>
         </w:rPr>
         <w:t>A implementação desta nova modalidade é sustentada por Acordos de Cooperação Técnica (ACT) firmados entre o Ministério da Gestão e da Inovação em Serviços Públicos (MGI) e os órgãos federais parceiros. Este acordo formaliza o suporte técnico para a internalização de políticas finalísticas no ecossistema de transferências da União, substituindo a análise documental analítica por uma sistemática de adesão rápida.</w:t>
       </w:r>
@@ -231,9 +324,9 @@
         <w:tc>
           <w:tcPr>
             <w:tcW w:type="dxa" w:w="8352"/>
-            <w:shd w:val="clear" w:color="auto" w:fill="F0FDF4"/>
+            <w:shd w:val="clear" w:color="auto" w:fill="F1F5F9"/>
             <w:tcBorders>
-              <w:left w:val="single" w:sz="36" w:space="0" w:color="10b981"/>
+              <w:left w:val="single" w:sz="36" w:space="0" w:color="3B82F6"/>
               <w:top w:val="none"/>
               <w:bottom w:val="none"/>
               <w:right w:val="none"/>
@@ -251,12 +344,12 @@
             </w:pPr>
             <w:r>
               <w:rPr>
-                <w:rFonts w:ascii="Calibri" w:hAnsi="Calibri"/>
+                <w:rFonts w:ascii="Verdana" w:hAnsi="Verdana"/>
                 <w:b/>
                 <w:color w:val="0F172A"/>
                 <w:sz w:val="21"/>
               </w:rPr>
-              <w:t>Papéis e Responsabilidades:</w:t>
+              <w:t>Mensagem Central:</w:t>
             </w:r>
           </w:p>
           <w:p>
@@ -265,7 +358,7 @@
             </w:pPr>
             <w:r>
               <w:rPr>
-                <w:rFonts w:ascii="Calibri" w:hAnsi="Calibri"/>
+                <w:rFonts w:ascii="Verdana" w:hAnsi="Verdana"/>
                 <w:color w:val="3C3C3C"/>
                 <w:sz w:val="20"/>
               </w:rPr>
@@ -278,7 +371,7 @@
             </w:pPr>
             <w:r>
               <w:rPr>
-                <w:rFonts w:ascii="Calibri" w:hAnsi="Calibri"/>
+                <w:rFonts w:ascii="Verdana" w:hAnsi="Verdana"/>
                 <w:color w:val="3C3C3C"/>
                 <w:sz w:val="20"/>
               </w:rPr>
@@ -300,12 +393,12 @@
       </w:pPr>
       <w:r>
         <w:rPr>
-          <w:rFonts w:ascii="Calibri" w:hAnsi="Calibri"/>
+          <w:rFonts w:ascii="Verdana" w:hAnsi="Verdana"/>
           <w:b/>
           <w:color w:val="0F172A"/>
           <w:sz w:val="28"/>
         </w:rPr>
-        <w:t>⚙️ 3. Arquitetura Técnica do TRANSFEREGOV.BR</w:t>
+        <w:t>⚙️ Arquitetura Técnica do TRANSFEREGOV.BR</w:t>
       </w:r>
     </w:p>
     <w:p>
@@ -314,9 +407,9 @@
       </w:pPr>
       <w:r>
         <w:rPr>
-          <w:rFonts w:ascii="Calibri" w:hAnsi="Calibri"/>
+          <w:rFonts w:ascii="Verdana" w:hAnsi="Verdana"/>
           <w:color w:val="334155"/>
-          <w:sz w:val="21"/>
+          <w:sz w:val="20"/>
         </w:rPr>
         <w:t>A robustez do TRANSFEREGOV.BR garante a integridade dos recursos federais. A arquitetura sistêmica é subdividida em três ambientes principais:</w:t>
       </w:r>
@@ -336,7 +429,7 @@
         <w:tc>
           <w:tcPr>
             <w:tcW w:type="dxa" w:w="4680"/>
-            <w:shd w:val="clear" w:color="auto" w:fill="0F172A"/>
+            <w:shd w:val="clear" w:color="auto" w:fill="2670E8"/>
           </w:tcPr>
           <w:p>
             <w:pPr>
@@ -344,6 +437,7 @@
             </w:pPr>
             <w:r>
               <w:rPr>
+                <w:rFonts w:ascii="Verdana" w:hAnsi="Verdana"/>
                 <w:b/>
                 <w:color w:val="FFFFFF"/>
               </w:rPr>
@@ -354,7 +448,7 @@
         <w:tc>
           <w:tcPr>
             <w:tcW w:type="dxa" w:w="4680"/>
-            <w:shd w:val="clear" w:color="auto" w:fill="0F172A"/>
+            <w:shd w:val="clear" w:color="auto" w:fill="2670E8"/>
           </w:tcPr>
           <w:p>
             <w:pPr>
@@ -362,6 +456,7 @@
             </w:pPr>
             <w:r>
               <w:rPr>
+                <w:rFonts w:ascii="Verdana" w:hAnsi="Verdana"/>
                 <w:b/>
                 <w:color w:val="FFFFFF"/>
               </w:rPr>
@@ -374,7 +469,7 @@
         <w:tc>
           <w:tcPr>
             <w:tcW w:type="dxa" w:w="4680"/>
-            <w:shd w:val="clear" w:color="auto" w:fill="F8FAFC"/>
+            <w:shd w:val="clear" w:color="auto" w:fill="F1F5F9"/>
           </w:tcPr>
           <w:p>
             <w:pPr>
@@ -382,6 +477,7 @@
             </w:pPr>
             <w:r>
               <w:rPr>
+                <w:rFonts w:ascii="Verdana" w:hAnsi="Verdana"/>
                 <w:b/>
                 <w:sz w:val="19"/>
               </w:rPr>
@@ -396,6 +492,7 @@
           <w:p>
             <w:r>
               <w:rPr>
+                <w:rFonts w:ascii="Verdana" w:hAnsi="Verdana"/>
                 <w:sz w:val="19"/>
               </w:rPr>
               <w:t>Simulador (sandbox) isolado destinado ao aprendizado das equipes técnicas, sem impacto orçamentário real.</w:t>
@@ -407,7 +504,7 @@
         <w:tc>
           <w:tcPr>
             <w:tcW w:type="dxa" w:w="4680"/>
-            <w:shd w:val="clear" w:color="auto" w:fill="F8FAFC"/>
+            <w:shd w:val="clear" w:color="auto" w:fill="F1F5F9"/>
           </w:tcPr>
           <w:p>
             <w:pPr>
@@ -415,6 +512,7 @@
             </w:pPr>
             <w:r>
               <w:rPr>
+                <w:rFonts w:ascii="Verdana" w:hAnsi="Verdana"/>
                 <w:b/>
                 <w:sz w:val="19"/>
               </w:rPr>
@@ -429,6 +527,7 @@
           <w:p>
             <w:r>
               <w:rPr>
+                <w:rFonts w:ascii="Verdana" w:hAnsi="Verdana"/>
                 <w:sz w:val="19"/>
               </w:rPr>
               <w:t>Validações finais de layouts, parametrizações e testes de integração de APIs com agentes bancários.</w:t>
@@ -440,7 +539,7 @@
         <w:tc>
           <w:tcPr>
             <w:tcW w:type="dxa" w:w="4680"/>
-            <w:shd w:val="clear" w:color="auto" w:fill="F8FAFC"/>
+            <w:shd w:val="clear" w:color="auto" w:fill="F1F5F9"/>
           </w:tcPr>
           <w:p>
             <w:pPr>
@@ -448,6 +547,7 @@
             </w:pPr>
             <w:r>
               <w:rPr>
+                <w:rFonts w:ascii="Verdana" w:hAnsi="Verdana"/>
                 <w:b/>
                 <w:sz w:val="19"/>
               </w:rPr>
@@ -462,6 +562,7 @@
           <w:p>
             <w:r>
               <w:rPr>
+                <w:rFonts w:ascii="Verdana" w:hAnsi="Verdana"/>
                 <w:sz w:val="19"/>
               </w:rPr>
               <w:t>Execução oficial das parcerias, com empenho no SIAFI, transações financeiras reais e monitoramento legal.</w:t>
@@ -481,9 +582,9 @@
       </w:pPr>
       <w:r>
         <w:rPr>
-          <w:rFonts w:ascii="Calibri" w:hAnsi="Calibri"/>
+          <w:rFonts w:ascii="Verdana" w:hAnsi="Verdana"/>
           <w:color w:val="334155"/>
-          <w:sz w:val="21"/>
+          <w:sz w:val="20"/>
         </w:rPr>
         <w:t>Solução Técnica SIORG: Para viabilizar a vinculação administrativa de conselhos ou fundos finalísticos sem código de Unidade Gestora própria, a plataforma utiliza a vinculação via código de SIORG (ex: código do Departamento Gestor de Recursos - 267384) e perfis específicos para servidores.</w:t>
       </w:r>
@@ -495,12 +596,12 @@
       </w:pPr>
       <w:r>
         <w:rPr>
-          <w:rFonts w:ascii="Calibri" w:hAnsi="Calibri"/>
+          <w:rFonts w:ascii="Verdana" w:hAnsi="Verdana"/>
           <w:b/>
           <w:color w:val="0F172A"/>
           <w:sz w:val="28"/>
         </w:rPr>
-        <w:t>🔧 4. Parametrização por Política Pública</w:t>
+        <w:t>🔧 Parametrização por Política Pública</w:t>
       </w:r>
     </w:p>
     <w:p>
@@ -509,9 +610,9 @@
       </w:pPr>
       <w:r>
         <w:rPr>
-          <w:rFonts w:ascii="Calibri" w:hAnsi="Calibri"/>
+          <w:rFonts w:ascii="Verdana" w:hAnsi="Verdana"/>
           <w:color w:val="334155"/>
-          <w:sz w:val="21"/>
+          <w:sz w:val="20"/>
         </w:rPr>
         <w:t>O Módulo de Gestão de Parcerias do TRANSFEREGOV.BR se adapta às particularidades de diferentes políticas públicas por meio de configurações no sistema:</w:t>
       </w:r>
@@ -523,9 +624,9 @@
       </w:pPr>
       <w:r>
         <w:rPr>
-          <w:rFonts w:ascii="Calibri" w:hAnsi="Calibri"/>
+          <w:rFonts w:ascii="Verdana" w:hAnsi="Verdana"/>
           <w:b/>
-          <w:color w:val="0369A1"/>
+          <w:color w:val="2670E8"/>
           <w:sz w:val="23"/>
         </w:rPr>
         <w:t>1. Requisitos de Habilitação</w:t>
@@ -537,9 +638,9 @@
       </w:pPr>
       <w:r>
         <w:rPr>
-          <w:rFonts w:ascii="Calibri" w:hAnsi="Calibri"/>
+          <w:rFonts w:ascii="Verdana" w:hAnsi="Verdana"/>
           <w:color w:val="334155"/>
-          <w:sz w:val="21"/>
+          <w:sz w:val="20"/>
         </w:rPr>
         <w:t>Definição automatizada de critérios técnicos e fiscais que os proponentes devem cumprir eletronicamente.</w:t>
       </w:r>
@@ -551,9 +652,9 @@
       </w:pPr>
       <w:r>
         <w:rPr>
-          <w:rFonts w:ascii="Calibri" w:hAnsi="Calibri"/>
+          <w:rFonts w:ascii="Verdana" w:hAnsi="Verdana"/>
           <w:b/>
-          <w:color w:val="0369A1"/>
+          <w:color w:val="2670E8"/>
           <w:sz w:val="23"/>
         </w:rPr>
         <w:t>2. Anexos Obrigatórios</w:t>
@@ -565,9 +666,9 @@
       </w:pPr>
       <w:r>
         <w:rPr>
-          <w:rFonts w:ascii="Calibri" w:hAnsi="Calibri"/>
+          <w:rFonts w:ascii="Verdana" w:hAnsi="Verdana"/>
           <w:color w:val="334155"/>
-          <w:sz w:val="21"/>
+          <w:sz w:val="20"/>
         </w:rPr>
         <w:t>Possibilidade de restringir a adesão à inserção de planos setoriais específicos de trabalho (ex: planos de contingência, declarações locais).</w:t>
       </w:r>
@@ -579,9 +680,9 @@
       </w:pPr>
       <w:r>
         <w:rPr>
-          <w:rFonts w:ascii="Calibri" w:hAnsi="Calibri"/>
+          <w:rFonts w:ascii="Verdana" w:hAnsi="Verdana"/>
           <w:b/>
-          <w:color w:val="0369A1"/>
+          <w:color w:val="2670E8"/>
           <w:sz w:val="23"/>
         </w:rPr>
         <w:t>3. Metas Padronizadas</w:t>
@@ -593,9 +694,9 @@
       </w:pPr>
       <w:r>
         <w:rPr>
-          <w:rFonts w:ascii="Calibri" w:hAnsi="Calibri"/>
+          <w:rFonts w:ascii="Verdana" w:hAnsi="Verdana"/>
           <w:color w:val="334155"/>
-          <w:sz w:val="21"/>
+          <w:sz w:val="20"/>
         </w:rPr>
         <w:t>Catálogo de entregas físicas predefinidas para a rápida adesão dos estados e municípios, eliminando propostas subjetivas.</w:t>
       </w:r>
@@ -607,12 +708,12 @@
       </w:pPr>
       <w:r>
         <w:rPr>
-          <w:rFonts w:ascii="Calibri" w:hAnsi="Calibri"/>
+          <w:rFonts w:ascii="Verdana" w:hAnsi="Verdana"/>
           <w:b/>
           <w:color w:val="0F172A"/>
           <w:sz w:val="28"/>
         </w:rPr>
-        <w:t>💳 5. Ordem de Pagamento de Parcerias (OPP)</w:t>
+        <w:t>💳 Ordem de Pagamento de Parcerias (OPP)</w:t>
       </w:r>
     </w:p>
     <w:p>
@@ -621,9 +722,9 @@
       </w:pPr>
       <w:r>
         <w:rPr>
-          <w:rFonts w:ascii="Calibri" w:hAnsi="Calibri"/>
+          <w:rFonts w:ascii="Verdana" w:hAnsi="Verdana"/>
           <w:color w:val="334155"/>
-          <w:sz w:val="21"/>
+          <w:sz w:val="20"/>
         </w:rPr>
         <w:t>A OPP é o instrumento financeiro definitivo de automatização bancária das parcerias. Ela assegura e agiliza a liberação dos recursos federais:</w:t>
       </w:r>
@@ -635,9 +736,9 @@
       </w:pPr>
       <w:r>
         <w:rPr>
-          <w:rFonts w:ascii="Calibri" w:hAnsi="Calibri"/>
+          <w:rFonts w:ascii="Verdana" w:hAnsi="Verdana"/>
           <w:b/>
-          <w:color w:val="0369A1"/>
+          <w:color w:val="2670E8"/>
           <w:sz w:val="23"/>
         </w:rPr>
         <w:t>⚡ Tempo Real via API</w:t>
@@ -649,9 +750,9 @@
       </w:pPr>
       <w:r>
         <w:rPr>
-          <w:rFonts w:ascii="Calibri" w:hAnsi="Calibri"/>
+          <w:rFonts w:ascii="Verdana" w:hAnsi="Verdana"/>
           <w:color w:val="334155"/>
-          <w:sz w:val="21"/>
+          <w:sz w:val="20"/>
         </w:rPr>
         <w:t>Conexão direta com bancos públicos oficiais, eliminando o processamento em lote (batch).</w:t>
       </w:r>
@@ -663,9 +764,9 @@
       </w:pPr>
       <w:r>
         <w:rPr>
-          <w:rFonts w:ascii="Calibri" w:hAnsi="Calibri"/>
+          <w:rFonts w:ascii="Verdana" w:hAnsi="Verdana"/>
           <w:b/>
-          <w:color w:val="0369A1"/>
+          <w:color w:val="2670E8"/>
           <w:sz w:val="23"/>
         </w:rPr>
         <w:t>🛡️ Dupla Assinatura</w:t>
@@ -677,9 +778,9 @@
       </w:pPr>
       <w:r>
         <w:rPr>
-          <w:rFonts w:ascii="Calibri" w:hAnsi="Calibri"/>
+          <w:rFonts w:ascii="Verdana" w:hAnsi="Verdana"/>
           <w:color w:val="334155"/>
-          <w:sz w:val="21"/>
+          <w:sz w:val="20"/>
         </w:rPr>
         <w:t>Exigência de dupla autorização eletrônica (Operador e Gestor) com certificação Gov.br Ouro.</w:t>
       </w:r>
@@ -691,9 +792,9 @@
       </w:pPr>
       <w:r>
         <w:rPr>
-          <w:rFonts w:ascii="Calibri" w:hAnsi="Calibri"/>
+          <w:rFonts w:ascii="Verdana" w:hAnsi="Verdana"/>
           <w:b/>
-          <w:color w:val="0369A1"/>
+          <w:color w:val="2670E8"/>
           <w:sz w:val="23"/>
         </w:rPr>
         <w:t>📱 Pix e QR Code</w:t>
@@ -705,9 +806,9 @@
       </w:pPr>
       <w:r>
         <w:rPr>
-          <w:rFonts w:ascii="Calibri" w:hAnsi="Calibri"/>
+          <w:rFonts w:ascii="Verdana" w:hAnsi="Verdana"/>
           <w:color w:val="334155"/>
-          <w:sz w:val="21"/>
+          <w:sz w:val="20"/>
         </w:rPr>
         <w:t>Pagamento direto a fornecedores e prestadores na ponta, garantindo conciliação imediata.</w:t>
       </w:r>
@@ -719,9 +820,9 @@
       </w:pPr>
       <w:r>
         <w:rPr>
-          <w:rFonts w:ascii="Calibri" w:hAnsi="Calibri"/>
+          <w:rFonts w:ascii="Verdana" w:hAnsi="Verdana"/>
           <w:b/>
-          <w:color w:val="0369A1"/>
+          <w:color w:val="2670E8"/>
           <w:sz w:val="23"/>
         </w:rPr>
         <w:t>⚙️ Controle Ativo</w:t>
@@ -733,9 +834,9 @@
       </w:pPr>
       <w:r>
         <w:rPr>
-          <w:rFonts w:ascii="Calibri" w:hAnsi="Calibri"/>
+          <w:rFonts w:ascii="Verdana" w:hAnsi="Verdana"/>
           <w:color w:val="334155"/>
-          <w:sz w:val="21"/>
+          <w:sz w:val="20"/>
         </w:rPr>
         <w:t>Prerrogativa do órgão federal de comandar o bloqueio e devolução de saldos não utilizados.</w:t>
       </w:r>
@@ -754,9 +855,9 @@
         <w:tc>
           <w:tcPr>
             <w:tcW w:type="dxa" w:w="8352"/>
-            <w:shd w:val="clear" w:color="auto" w:fill="FFFDF0"/>
+            <w:shd w:val="clear" w:color="auto" w:fill="F0F6FF"/>
             <w:tcBorders>
-              <w:left w:val="single" w:sz="36" w:space="0" w:color="f59e0b"/>
+              <w:left w:val="single" w:sz="36" w:space="0" w:color="2670E8"/>
               <w:top w:val="none"/>
               <w:bottom w:val="none"/>
               <w:right w:val="none"/>
@@ -774,12 +875,12 @@
             </w:pPr>
             <w:r>
               <w:rPr>
-                <w:rFonts w:ascii="Calibri" w:hAnsi="Calibri"/>
+                <w:rFonts w:ascii="Verdana" w:hAnsi="Verdana"/>
                 <w:b/>
                 <w:color w:val="0F172A"/>
                 <w:sz w:val="21"/>
               </w:rPr>
-              <w:t>Ficha Técnica e Prazos:</w:t>
+              <w:t>Importante — Ficha Técnica e Prazos:</w:t>
             </w:r>
           </w:p>
           <w:p>
@@ -788,7 +889,7 @@
             </w:pPr>
             <w:r>
               <w:rPr>
-                <w:rFonts w:ascii="Calibri" w:hAnsi="Calibri"/>
+                <w:rFonts w:ascii="Verdana" w:hAnsi="Verdana"/>
                 <w:color w:val="3C3C3C"/>
                 <w:sz w:val="20"/>
               </w:rPr>
@@ -810,12 +911,12 @@
       </w:pPr>
       <w:r>
         <w:rPr>
-          <w:rFonts w:ascii="Calibri" w:hAnsi="Calibri"/>
+          <w:rFonts w:ascii="Verdana" w:hAnsi="Verdana"/>
           <w:b/>
           <w:color w:val="0F172A"/>
           <w:sz w:val="28"/>
         </w:rPr>
-        <w:t>🗺️ 6. Jornada da Transferência</w:t>
+        <w:t>🗺️ Jornada da Transferência</w:t>
       </w:r>
     </w:p>
     <w:p>
@@ -824,9 +925,9 @@
       </w:pPr>
       <w:r>
         <w:rPr>
-          <w:rFonts w:ascii="Calibri" w:hAnsi="Calibri"/>
+          <w:rFonts w:ascii="Verdana" w:hAnsi="Verdana"/>
           <w:color w:val="334155"/>
-          <w:sz w:val="21"/>
+          <w:sz w:val="20"/>
         </w:rPr>
         <w:t>A jornada de repasses simplificados substitui os planos de trabalho densos por um fluxo lógico em 5 etapas no sistema:</w:t>
       </w:r>
@@ -837,9 +938,9 @@
       </w:pPr>
       <w:r>
         <w:rPr>
-          <w:rFonts w:ascii="Calibri" w:hAnsi="Calibri"/>
+          <w:rFonts w:ascii="Verdana" w:hAnsi="Verdana"/>
           <w:color w:val="334155"/>
-          <w:sz w:val="21"/>
+          <w:sz w:val="20"/>
         </w:rPr>
         <w:t>• 01. Convocatória: O órgão concedente cadastra a chamada pública, metas físicas padronizadas e prazos no sistema.</w:t>
       </w:r>
@@ -850,9 +951,9 @@
       </w:pPr>
       <w:r>
         <w:rPr>
-          <w:rFonts w:ascii="Calibri" w:hAnsi="Calibri"/>
+          <w:rFonts w:ascii="Verdana" w:hAnsi="Verdana"/>
           <w:color w:val="334155"/>
-          <w:sz w:val="21"/>
+          <w:sz w:val="20"/>
         </w:rPr>
         <w:t>• 02. Proposição: O ente subnacional adere digitalmente à chamada, preenchendo as informações e anexando os documentos.</w:t>
       </w:r>
@@ -863,9 +964,9 @@
       </w:pPr>
       <w:r>
         <w:rPr>
-          <w:rFonts w:ascii="Calibri" w:hAnsi="Calibri"/>
+          <w:rFonts w:ascii="Verdana" w:hAnsi="Verdana"/>
           <w:color w:val="334155"/>
-          <w:sz w:val="21"/>
+          <w:sz w:val="20"/>
         </w:rPr>
         <w:t>• 03. Validação: O concedente realiza a análise da habilitação eletrônica e emite o parecer de aprovação.</w:t>
       </w:r>
@@ -876,9 +977,9 @@
       </w:pPr>
       <w:r>
         <w:rPr>
-          <w:rFonts w:ascii="Calibri" w:hAnsi="Calibri"/>
+          <w:rFonts w:ascii="Verdana" w:hAnsi="Verdana"/>
           <w:color w:val="334155"/>
-          <w:sz w:val="21"/>
+          <w:sz w:val="20"/>
         </w:rPr>
         <w:t>• 04. SIAFI: O sistema realiza o empenho automático e o comando de abertura de conta bancária vinculada.</w:t>
       </w:r>
@@ -889,9 +990,9 @@
       </w:pPr>
       <w:r>
         <w:rPr>
-          <w:rFonts w:ascii="Calibri" w:hAnsi="Calibri"/>
+          <w:rFonts w:ascii="Verdana" w:hAnsi="Verdana"/>
           <w:color w:val="334155"/>
-          <w:sz w:val="21"/>
+          <w:sz w:val="20"/>
         </w:rPr>
         <w:t>• 05. Ciclo Final: O ente executa as metas físicas e apresenta o Relatório de Execução Simplificado focado nas entregas.</w:t>
       </w:r>
@@ -903,12 +1004,12 @@
       </w:pPr>
       <w:r>
         <w:rPr>
-          <w:rFonts w:ascii="Calibri" w:hAnsi="Calibri"/>
+          <w:rFonts w:ascii="Verdana" w:hAnsi="Verdana"/>
           <w:b/>
           <w:color w:val="0F172A"/>
           <w:sz w:val="28"/>
         </w:rPr>
-        <w:t>❓ 7. Dúvidas Operacionais (FAQ)</w:t>
+        <w:t>❓ Dúvidas Operacionais (FAQ)</w:t>
       </w:r>
     </w:p>
     <w:tbl>
@@ -925,9 +1026,9 @@
         <w:tc>
           <w:tcPr>
             <w:tcW w:type="dxa" w:w="8352"/>
-            <w:shd w:val="clear" w:color="auto" w:fill="F0F9FF"/>
+            <w:shd w:val="clear" w:color="auto" w:fill="F0F6FF"/>
             <w:tcBorders>
-              <w:left w:val="single" w:sz="36" w:space="0" w:color="0284c7"/>
+              <w:left w:val="single" w:sz="36" w:space="0" w:color="2670E8"/>
               <w:top w:val="none"/>
               <w:bottom w:val="none"/>
               <w:right w:val="none"/>
@@ -945,7 +1046,7 @@
             </w:pPr>
             <w:r>
               <w:rPr>
-                <w:rFonts w:ascii="Calibri" w:hAnsi="Calibri"/>
+                <w:rFonts w:ascii="Verdana" w:hAnsi="Verdana"/>
                 <w:b/>
                 <w:color w:val="0F172A"/>
                 <w:sz w:val="21"/>
@@ -959,7 +1060,7 @@
             </w:pPr>
             <w:r>
               <w:rPr>
-                <w:rFonts w:ascii="Calibri" w:hAnsi="Calibri"/>
+                <w:rFonts w:ascii="Verdana" w:hAnsi="Verdana"/>
                 <w:color w:val="3C3C3C"/>
                 <w:sz w:val="20"/>
               </w:rPr>
@@ -988,9 +1089,9 @@
         <w:tc>
           <w:tcPr>
             <w:tcW w:type="dxa" w:w="8352"/>
-            <w:shd w:val="clear" w:color="auto" w:fill="F0F9FF"/>
+            <w:shd w:val="clear" w:color="auto" w:fill="F0F6FF"/>
             <w:tcBorders>
-              <w:left w:val="single" w:sz="36" w:space="0" w:color="0284c7"/>
+              <w:left w:val="single" w:sz="36" w:space="0" w:color="2670E8"/>
               <w:top w:val="none"/>
               <w:bottom w:val="none"/>
               <w:right w:val="none"/>
@@ -1008,12 +1109,12 @@
             </w:pPr>
             <w:r>
               <w:rPr>
-                <w:rFonts w:ascii="Calibri" w:hAnsi="Calibri"/>
+                <w:rFonts w:ascii="Verdana" w:hAnsi="Verdana"/>
                 <w:b/>
                 <w:color w:val="0F172A"/>
                 <w:sz w:val="21"/>
               </w:rPr>
-              <w:t>❓ O que é a parametrização das políticas públicas?</w:t>
+              <w:t>❓ O que significa parametrizar o edital?</w:t>
             </w:r>
           </w:p>
           <w:p>
@@ -1022,7 +1123,7 @@
             </w:pPr>
             <w:r>
               <w:rPr>
-                <w:rFonts w:ascii="Calibri" w:hAnsi="Calibri"/>
+                <w:rFonts w:ascii="Verdana" w:hAnsi="Verdana"/>
                 <w:color w:val="3C3C3C"/>
                 <w:sz w:val="20"/>
               </w:rPr>
@@ -1051,9 +1152,9 @@
         <w:tc>
           <w:tcPr>
             <w:tcW w:type="dxa" w:w="8352"/>
-            <w:shd w:val="clear" w:color="auto" w:fill="F0F9FF"/>
+            <w:shd w:val="clear" w:color="auto" w:fill="F0F6FF"/>
             <w:tcBorders>
-              <w:left w:val="single" w:sz="36" w:space="0" w:color="0284c7"/>
+              <w:left w:val="single" w:sz="36" w:space="0" w:color="2670E8"/>
               <w:top w:val="none"/>
               <w:bottom w:val="none"/>
               <w:right w:val="none"/>
@@ -1071,12 +1172,12 @@
             </w:pPr>
             <w:r>
               <w:rPr>
-                <w:rFonts w:ascii="Calibri" w:hAnsi="Calibri"/>
+                <w:rFonts w:ascii="Verdana" w:hAnsi="Verdana"/>
                 <w:b/>
                 <w:color w:val="0F172A"/>
                 <w:sz w:val="21"/>
               </w:rPr>
-              <w:t>❓ Qual a importância do ambiente de Treinamento?</w:t>
+              <w:t>❓ Qual a importância da Sandbox de Treinamento?</w:t>
             </w:r>
           </w:p>
           <w:p>
@@ -1085,11 +1186,11 @@
             </w:pPr>
             <w:r>
               <w:rPr>
-                <w:rFonts w:ascii="Calibri" w:hAnsi="Calibri"/>
+                <w:rFonts w:ascii="Verdana" w:hAnsi="Verdana"/>
                 <w:color w:val="3C3C3C"/>
                 <w:sz w:val="20"/>
               </w:rPr>
-              <w:t>Funciona como um simulador (sandbox) isolado, permitindo que os técnicos simulem a parametrização e execução de forma prática e sem risco fiscal.</w:t>
+              <w:t>Funciona como um simulador (sandbox) isolado, permitindo testes práticos de empenho e execução de forma prática e sem risco fiscal real.</w:t>
             </w:r>
           </w:p>
         </w:tc>
@@ -1114,9 +1215,9 @@
         <w:tc>
           <w:tcPr>
             <w:tcW w:type="dxa" w:w="8352"/>
-            <w:shd w:val="clear" w:color="auto" w:fill="F0F9FF"/>
+            <w:shd w:val="clear" w:color="auto" w:fill="F0F6FF"/>
             <w:tcBorders>
-              <w:left w:val="single" w:sz="36" w:space="0" w:color="0284c7"/>
+              <w:left w:val="single" w:sz="36" w:space="0" w:color="2670E8"/>
               <w:top w:val="none"/>
               <w:bottom w:val="none"/>
               <w:right w:val="none"/>
@@ -1134,7 +1235,7 @@
             </w:pPr>
             <w:r>
               <w:rPr>
-                <w:rFonts w:ascii="Calibri" w:hAnsi="Calibri"/>
+                <w:rFonts w:ascii="Verdana" w:hAnsi="Verdana"/>
                 <w:b/>
                 <w:color w:val="0F172A"/>
                 <w:sz w:val="21"/>
@@ -1148,7 +1249,7 @@
             </w:pPr>
             <w:r>
               <w:rPr>
-                <w:rFonts w:ascii="Calibri" w:hAnsi="Calibri"/>
+                <w:rFonts w:ascii="Verdana" w:hAnsi="Verdana"/>
                 <w:color w:val="3C3C3C"/>
                 <w:sz w:val="20"/>
               </w:rPr>
@@ -1170,12 +1271,12 @@
       </w:pPr>
       <w:r>
         <w:rPr>
-          <w:rFonts w:ascii="Calibri" w:hAnsi="Calibri"/>
+          <w:rFonts w:ascii="Verdana" w:hAnsi="Verdana"/>
           <w:b/>
           <w:color w:val="0F172A"/>
           <w:sz w:val="28"/>
         </w:rPr>
-        <w:t>⚠️ 8. Pontos de Atenção e Riscos</w:t>
+        <w:t>⚠️ Pontos de Atenção e Riscos</w:t>
       </w:r>
     </w:p>
     <w:tbl>
@@ -1194,7 +1295,7 @@
             <w:tcW w:type="dxa" w:w="8352"/>
             <w:shd w:val="clear" w:color="auto" w:fill="FEF2F2"/>
             <w:tcBorders>
-              <w:left w:val="single" w:sz="36" w:space="0" w:color="ef4444"/>
+              <w:left w:val="single" w:sz="36" w:space="0" w:color="EF4444"/>
               <w:top w:val="none"/>
               <w:bottom w:val="none"/>
               <w:right w:val="none"/>
@@ -1212,12 +1313,12 @@
             </w:pPr>
             <w:r>
               <w:rPr>
-                <w:rFonts w:ascii="Calibri" w:hAnsi="Calibri"/>
+                <w:rFonts w:ascii="Verdana" w:hAnsi="Verdana"/>
                 <w:b/>
                 <w:color w:val="0F172A"/>
                 <w:sz w:val="21"/>
               </w:rPr>
-              <w:t>⚠️ Sintoma do Convênio (Resistência)</w:t>
+              <w:t>Atenção — Sintoma do Convênio (Resistência Cultural)</w:t>
             </w:r>
           </w:p>
           <w:p>
@@ -1226,7 +1327,7 @@
             </w:pPr>
             <w:r>
               <w:rPr>
-                <w:rFonts w:ascii="Calibri" w:hAnsi="Calibri"/>
+                <w:rFonts w:ascii="Verdana" w:hAnsi="Verdana"/>
                 <w:color w:val="3C3C3C"/>
                 <w:sz w:val="20"/>
               </w:rPr>
@@ -1257,7 +1358,7 @@
             <w:tcW w:type="dxa" w:w="8352"/>
             <w:shd w:val="clear" w:color="auto" w:fill="FEF2F2"/>
             <w:tcBorders>
-              <w:left w:val="single" w:sz="36" w:space="0" w:color="ef4444"/>
+              <w:left w:val="single" w:sz="36" w:space="0" w:color="EF4444"/>
               <w:top w:val="none"/>
               <w:bottom w:val="none"/>
               <w:right w:val="none"/>
@@ -1275,12 +1376,12 @@
             </w:pPr>
             <w:r>
               <w:rPr>
-                <w:rFonts w:ascii="Calibri" w:hAnsi="Calibri"/>
+                <w:rFonts w:ascii="Verdana" w:hAnsi="Verdana"/>
                 <w:b/>
                 <w:color w:val="0F172A"/>
                 <w:sz w:val="21"/>
               </w:rPr>
-              <w:t>⚠️ Prazos do Defeso Eleitoral</w:t>
+              <w:t>Atenção — Prazos do Defeso Eleitoral</w:t>
             </w:r>
           </w:p>
           <w:p>
@@ -1289,11 +1390,11 @@
             </w:pPr>
             <w:r>
               <w:rPr>
-                <w:rFonts w:ascii="Calibri" w:hAnsi="Calibri"/>
+                <w:rFonts w:ascii="Verdana" w:hAnsi="Verdana"/>
                 <w:color w:val="3C3C3C"/>
                 <w:sz w:val="20"/>
               </w:rPr>
-              <w:t>Observância estrita do calendário eleitoral ordinário. Importante notar que apenas programas finalísticos de caráter de Emergência ou Calamidade Pública formalmente decretada possuem prerrogativas excepcionais de repasse.</w:t>
+              <w:t>Observância estrita do calendário eleitoral ordinário. Importante notar que apenas programas de Emergência ou Calamidade Pública formalmente decretada por portaria ministerial ativa possuem exceções de continuidade.</w:t>
             </w:r>
           </w:p>
         </w:tc>
@@ -1311,12 +1412,12 @@
       </w:pPr>
       <w:r>
         <w:rPr>
-          <w:rFonts w:ascii="Calibri" w:hAnsi="Calibri"/>
+          <w:rFonts w:ascii="Verdana" w:hAnsi="Verdana"/>
           <w:b/>
           <w:color w:val="0F172A"/>
           <w:sz w:val="28"/>
         </w:rPr>
-        <w:t>✅ 9. Boas Práticas Operacionais</w:t>
+        <w:t>✅ Boas Práticas Operacionais</w:t>
       </w:r>
     </w:p>
     <w:tbl>
@@ -1335,7 +1436,7 @@
             <w:tcW w:type="dxa" w:w="8352"/>
             <w:shd w:val="clear" w:color="auto" w:fill="F0FDF4"/>
             <w:tcBorders>
-              <w:left w:val="single" w:sz="36" w:space="0" w:color="10b981"/>
+              <w:left w:val="single" w:sz="36" w:space="0" w:color="10B981"/>
               <w:top w:val="none"/>
               <w:bottom w:val="none"/>
               <w:right w:val="none"/>
@@ -1353,12 +1454,12 @@
             </w:pPr>
             <w:r>
               <w:rPr>
-                <w:rFonts w:ascii="Calibri" w:hAnsi="Calibri"/>
+                <w:rFonts w:ascii="Verdana" w:hAnsi="Verdana"/>
                 <w:b/>
                 <w:color w:val="0F172A"/>
                 <w:sz w:val="21"/>
               </w:rPr>
-              <w:t>✅ Treinamento Prévio em Sandbox</w:t>
+              <w:t>Mensagem Central — Treinamento Prévio em Sandbox</w:t>
             </w:r>
           </w:p>
           <w:p>
@@ -1367,7 +1468,7 @@
             </w:pPr>
             <w:r>
               <w:rPr>
-                <w:rFonts w:ascii="Calibri" w:hAnsi="Calibri"/>
+                <w:rFonts w:ascii="Verdana" w:hAnsi="Verdana"/>
                 <w:color w:val="3C3C3C"/>
                 <w:sz w:val="20"/>
               </w:rPr>
@@ -1398,7 +1499,7 @@
             <w:tcW w:type="dxa" w:w="8352"/>
             <w:shd w:val="clear" w:color="auto" w:fill="F0FDF4"/>
             <w:tcBorders>
-              <w:left w:val="single" w:sz="36" w:space="0" w:color="10b981"/>
+              <w:left w:val="single" w:sz="36" w:space="0" w:color="10B981"/>
               <w:top w:val="none"/>
               <w:bottom w:val="none"/>
               <w:right w:val="none"/>
@@ -1416,12 +1517,12 @@
             </w:pPr>
             <w:r>
               <w:rPr>
-                <w:rFonts w:ascii="Calibri" w:hAnsi="Calibri"/>
+                <w:rFonts w:ascii="Verdana" w:hAnsi="Verdana"/>
                 <w:b/>
                 <w:color w:val="0F172A"/>
                 <w:sz w:val="21"/>
               </w:rPr>
-              <w:t>✅ Canais de Comunicação Permanentes</w:t>
+              <w:t>Mensagem Central — Diálogo Técnico Permanente</w:t>
             </w:r>
           </w:p>
           <w:p>
@@ -1430,7 +1531,7 @@
             </w:pPr>
             <w:r>
               <w:rPr>
-                <w:rFonts w:ascii="Calibri" w:hAnsi="Calibri"/>
+                <w:rFonts w:ascii="Verdana" w:hAnsi="Verdana"/>
                 <w:color w:val="3C3C3C"/>
                 <w:sz w:val="20"/>
               </w:rPr>
@@ -1444,6 +1545,495 @@
       <w:pPr>
         <w:spacing w:before="120" w:after="120"/>
       </w:pPr>
+    </w:p>
+    <w:p>
+      <w:r>
+        <w:br w:type="page"/>
+      </w:r>
+    </w:p>
+    <w:p>
+      <w:pPr>
+        <w:keepNext/>
+        <w:spacing w:before="320" w:after="160"/>
+      </w:pPr>
+      <w:r>
+        <w:rPr>
+          <w:rFonts w:ascii="Verdana" w:hAnsi="Verdana"/>
+          <w:b/>
+          <w:color w:val="0F172A"/>
+          <w:sz w:val="28"/>
+        </w:rPr>
+        <w:t>📖 Glossário Técnico</w:t>
+      </w:r>
+    </w:p>
+    <w:tbl>
+      <w:tblPr>
+        <w:tblW w:type="auto" w:w="0"/>
+        <w:jc w:val="center"/>
+        <w:tblLayout w:type="fixed"/>
+        <w:tblLook w:firstColumn="1" w:firstRow="1" w:lastColumn="0" w:lastRow="0" w:noHBand="0" w:noVBand="1" w:val="04A0"/>
+      </w:tblPr>
+      <w:tblGrid>
+        <w:gridCol w:w="9360"/>
+      </w:tblGrid>
+      <w:tr>
+        <w:tc>
+          <w:tcPr>
+            <w:tcW w:type="dxa" w:w="8352"/>
+            <w:shd w:val="clear" w:color="auto" w:fill="F8FAFC"/>
+            <w:tcBorders>
+              <w:left w:val="single" w:sz="36" w:space="0" w:color="2670E8"/>
+              <w:top w:val="none"/>
+              <w:bottom w:val="none"/>
+              <w:right w:val="none"/>
+            </w:tcBorders>
+            <w:tcMar>
+              <w:top w:w="150" w:type="dxa"/>
+              <w:bottom w:w="150" w:type="dxa"/>
+              <w:left w:w="250" w:type="dxa"/>
+              <w:right w:w="200" w:type="dxa"/>
+            </w:tcMar>
+          </w:tcPr>
+          <w:p>
+            <w:pPr>
+              <w:spacing w:before="0" w:after="80"/>
+            </w:pPr>
+            <w:r>
+              <w:rPr>
+                <w:rFonts w:ascii="Verdana" w:hAnsi="Verdana"/>
+                <w:b/>
+                <w:color w:val="0F172A"/>
+                <w:sz w:val="21"/>
+              </w:rPr>
+              <w:t>TRANSFEREGOV.BR</w:t>
+            </w:r>
+          </w:p>
+          <w:p>
+            <w:pPr>
+              <w:spacing w:before="80" w:after="80" w:line="276" w:lineRule="auto"/>
+            </w:pPr>
+            <w:r>
+              <w:rPr>
+                <w:rFonts w:ascii="Verdana" w:hAnsi="Verdana"/>
+                <w:color w:val="3C3C3C"/>
+                <w:sz w:val="20"/>
+              </w:rPr>
+              <w:t>Plataforma integrada de operacionalização e controle das parcerias financeiras do Governo Federal.</w:t>
+            </w:r>
+          </w:p>
+        </w:tc>
+      </w:tr>
+    </w:tbl>
+    <w:p>
+      <w:pPr>
+        <w:spacing w:before="120" w:after="120"/>
+      </w:pPr>
+    </w:p>
+    <w:tbl>
+      <w:tblPr>
+        <w:tblW w:type="auto" w:w="0"/>
+        <w:jc w:val="center"/>
+        <w:tblLayout w:type="fixed"/>
+        <w:tblLook w:firstColumn="1" w:firstRow="1" w:lastColumn="0" w:lastRow="0" w:noHBand="0" w:noVBand="1" w:val="04A0"/>
+      </w:tblPr>
+      <w:tblGrid>
+        <w:gridCol w:w="9360"/>
+      </w:tblGrid>
+      <w:tr>
+        <w:tc>
+          <w:tcPr>
+            <w:tcW w:type="dxa" w:w="8352"/>
+            <w:shd w:val="clear" w:color="auto" w:fill="F8FAFC"/>
+            <w:tcBorders>
+              <w:left w:val="single" w:sz="36" w:space="0" w:color="2670E8"/>
+              <w:top w:val="none"/>
+              <w:bottom w:val="none"/>
+              <w:right w:val="none"/>
+            </w:tcBorders>
+            <w:tcMar>
+              <w:top w:w="150" w:type="dxa"/>
+              <w:bottom w:w="150" w:type="dxa"/>
+              <w:left w:w="250" w:type="dxa"/>
+              <w:right w:w="200" w:type="dxa"/>
+            </w:tcMar>
+          </w:tcPr>
+          <w:p>
+            <w:pPr>
+              <w:spacing w:before="0" w:after="80"/>
+            </w:pPr>
+            <w:r>
+              <w:rPr>
+                <w:rFonts w:ascii="Verdana" w:hAnsi="Verdana"/>
+                <w:b/>
+                <w:color w:val="0F172A"/>
+                <w:sz w:val="21"/>
+              </w:rPr>
+              <w:t>SIORG</w:t>
+            </w:r>
+          </w:p>
+          <w:p>
+            <w:pPr>
+              <w:spacing w:before="80" w:after="80" w:line="276" w:lineRule="auto"/>
+            </w:pPr>
+            <w:r>
+              <w:rPr>
+                <w:rFonts w:ascii="Verdana" w:hAnsi="Verdana"/>
+                <w:color w:val="3C3C3C"/>
+                <w:sz w:val="20"/>
+              </w:rPr>
+              <w:t>Sistema de Informações Organizacionais do Governo Federal. Utilizado para mapeamento de responsabilidades administrativas no módulo.</w:t>
+            </w:r>
+          </w:p>
+        </w:tc>
+      </w:tr>
+    </w:tbl>
+    <w:p>
+      <w:pPr>
+        <w:spacing w:before="120" w:after="120"/>
+      </w:pPr>
+    </w:p>
+    <w:tbl>
+      <w:tblPr>
+        <w:tblW w:type="auto" w:w="0"/>
+        <w:jc w:val="center"/>
+        <w:tblLayout w:type="fixed"/>
+        <w:tblLook w:firstColumn="1" w:firstRow="1" w:lastColumn="0" w:lastRow="0" w:noHBand="0" w:noVBand="1" w:val="04A0"/>
+      </w:tblPr>
+      <w:tblGrid>
+        <w:gridCol w:w="9360"/>
+      </w:tblGrid>
+      <w:tr>
+        <w:tc>
+          <w:tcPr>
+            <w:tcW w:type="dxa" w:w="8352"/>
+            <w:shd w:val="clear" w:color="auto" w:fill="F8FAFC"/>
+            <w:tcBorders>
+              <w:left w:val="single" w:sz="36" w:space="0" w:color="2670E8"/>
+              <w:top w:val="none"/>
+              <w:bottom w:val="none"/>
+              <w:right w:val="none"/>
+            </w:tcBorders>
+            <w:tcMar>
+              <w:top w:w="150" w:type="dxa"/>
+              <w:bottom w:w="150" w:type="dxa"/>
+              <w:left w:w="250" w:type="dxa"/>
+              <w:right w:w="200" w:type="dxa"/>
+            </w:tcMar>
+          </w:tcPr>
+          <w:p>
+            <w:pPr>
+              <w:spacing w:before="0" w:after="80"/>
+            </w:pPr>
+            <w:r>
+              <w:rPr>
+                <w:rFonts w:ascii="Verdana" w:hAnsi="Verdana"/>
+                <w:b/>
+                <w:color w:val="0F172A"/>
+                <w:sz w:val="21"/>
+              </w:rPr>
+              <w:t>SIAFI</w:t>
+            </w:r>
+          </w:p>
+          <w:p>
+            <w:pPr>
+              <w:spacing w:before="80" w:after="80" w:line="276" w:lineRule="auto"/>
+            </w:pPr>
+            <w:r>
+              <w:rPr>
+                <w:rFonts w:ascii="Verdana" w:hAnsi="Verdana"/>
+                <w:color w:val="3C3C3C"/>
+                <w:sz w:val="20"/>
+              </w:rPr>
+              <w:t>Sistema Integrado de Administração Financeira do Governo Federal. Responsável pelo empenho de fundos e abertura de contas bancárias vinculadas.</w:t>
+            </w:r>
+          </w:p>
+        </w:tc>
+      </w:tr>
+    </w:tbl>
+    <w:p>
+      <w:pPr>
+        <w:spacing w:before="120" w:after="120"/>
+      </w:pPr>
+    </w:p>
+    <w:tbl>
+      <w:tblPr>
+        <w:tblW w:type="auto" w:w="0"/>
+        <w:jc w:val="center"/>
+        <w:tblLayout w:type="fixed"/>
+        <w:tblLook w:firstColumn="1" w:firstRow="1" w:lastColumn="0" w:lastRow="0" w:noHBand="0" w:noVBand="1" w:val="04A0"/>
+      </w:tblPr>
+      <w:tblGrid>
+        <w:gridCol w:w="9360"/>
+      </w:tblGrid>
+      <w:tr>
+        <w:tc>
+          <w:tcPr>
+            <w:tcW w:type="dxa" w:w="8352"/>
+            <w:shd w:val="clear" w:color="auto" w:fill="F8FAFC"/>
+            <w:tcBorders>
+              <w:left w:val="single" w:sz="36" w:space="0" w:color="2670E8"/>
+              <w:top w:val="none"/>
+              <w:bottom w:val="none"/>
+              <w:right w:val="none"/>
+            </w:tcBorders>
+            <w:tcMar>
+              <w:top w:w="150" w:type="dxa"/>
+              <w:bottom w:w="150" w:type="dxa"/>
+              <w:left w:w="250" w:type="dxa"/>
+              <w:right w:w="200" w:type="dxa"/>
+            </w:tcMar>
+          </w:tcPr>
+          <w:p>
+            <w:pPr>
+              <w:spacing w:before="0" w:after="80"/>
+            </w:pPr>
+            <w:r>
+              <w:rPr>
+                <w:rFonts w:ascii="Verdana" w:hAnsi="Verdana"/>
+                <w:b/>
+                <w:color w:val="0F172A"/>
+                <w:sz w:val="21"/>
+              </w:rPr>
+              <w:t>OPP</w:t>
+            </w:r>
+          </w:p>
+          <w:p>
+            <w:pPr>
+              <w:spacing w:before="80" w:after="80" w:line="276" w:lineRule="auto"/>
+            </w:pPr>
+            <w:r>
+              <w:rPr>
+                <w:rFonts w:ascii="Verdana" w:hAnsi="Verdana"/>
+                <w:color w:val="3C3C3C"/>
+                <w:sz w:val="20"/>
+              </w:rPr>
+              <w:t>Ordem de Pagamento de Parcerias. Canal de liquidação bancária automatizada e transparente em tempo real via Pix/QR Code.</w:t>
+            </w:r>
+          </w:p>
+        </w:tc>
+      </w:tr>
+    </w:tbl>
+    <w:p>
+      <w:pPr>
+        <w:spacing w:before="120" w:after="120"/>
+      </w:pPr>
+    </w:p>
+    <w:tbl>
+      <w:tblPr>
+        <w:tblW w:type="auto" w:w="0"/>
+        <w:jc w:val="center"/>
+        <w:tblLayout w:type="fixed"/>
+        <w:tblLook w:firstColumn="1" w:firstRow="1" w:lastColumn="0" w:lastRow="0" w:noHBand="0" w:noVBand="1" w:val="04A0"/>
+      </w:tblPr>
+      <w:tblGrid>
+        <w:gridCol w:w="9360"/>
+      </w:tblGrid>
+      <w:tr>
+        <w:tc>
+          <w:tcPr>
+            <w:tcW w:type="dxa" w:w="8352"/>
+            <w:shd w:val="clear" w:color="auto" w:fill="F8FAFC"/>
+            <w:tcBorders>
+              <w:left w:val="single" w:sz="36" w:space="0" w:color="2670E8"/>
+              <w:top w:val="none"/>
+              <w:bottom w:val="none"/>
+              <w:right w:val="none"/>
+            </w:tcBorders>
+            <w:tcMar>
+              <w:top w:w="150" w:type="dxa"/>
+              <w:bottom w:w="150" w:type="dxa"/>
+              <w:left w:w="250" w:type="dxa"/>
+              <w:right w:w="200" w:type="dxa"/>
+            </w:tcMar>
+          </w:tcPr>
+          <w:p>
+            <w:pPr>
+              <w:spacing w:before="0" w:after="80"/>
+            </w:pPr>
+            <w:r>
+              <w:rPr>
+                <w:rFonts w:ascii="Verdana" w:hAnsi="Verdana"/>
+                <w:b/>
+                <w:color w:val="0F172A"/>
+                <w:sz w:val="21"/>
+              </w:rPr>
+              <w:t>ACT</w:t>
+            </w:r>
+          </w:p>
+          <w:p>
+            <w:pPr>
+              <w:spacing w:before="80" w:after="80" w:line="276" w:lineRule="auto"/>
+            </w:pPr>
+            <w:r>
+              <w:rPr>
+                <w:rFonts w:ascii="Verdana" w:hAnsi="Verdana"/>
+                <w:color w:val="3C3C3C"/>
+                <w:sz w:val="20"/>
+              </w:rPr>
+              <w:t>Acordo de Cooperação Técnica. Instrumento legal celebrado entre o MGI e o ministério parceiro para reger a utilização da Transferência Simplificada.</w:t>
+            </w:r>
+          </w:p>
+        </w:tc>
+      </w:tr>
+    </w:tbl>
+    <w:p>
+      <w:pPr>
+        <w:spacing w:before="120" w:after="120"/>
+      </w:pPr>
+    </w:p>
+    <w:tbl>
+      <w:tblPr>
+        <w:tblW w:type="auto" w:w="0"/>
+        <w:jc w:val="center"/>
+        <w:tblLayout w:type="fixed"/>
+        <w:tblLook w:firstColumn="1" w:firstRow="1" w:lastColumn="0" w:lastRow="0" w:noHBand="0" w:noVBand="1" w:val="04A0"/>
+      </w:tblPr>
+      <w:tblGrid>
+        <w:gridCol w:w="9360"/>
+      </w:tblGrid>
+      <w:tr>
+        <w:tc>
+          <w:tcPr>
+            <w:tcW w:type="dxa" w:w="8352"/>
+            <w:shd w:val="clear" w:color="auto" w:fill="F8FAFC"/>
+            <w:tcBorders>
+              <w:left w:val="single" w:sz="36" w:space="0" w:color="2670E8"/>
+              <w:top w:val="none"/>
+              <w:bottom w:val="none"/>
+              <w:right w:val="none"/>
+            </w:tcBorders>
+            <w:tcMar>
+              <w:top w:w="150" w:type="dxa"/>
+              <w:bottom w:w="150" w:type="dxa"/>
+              <w:left w:w="250" w:type="dxa"/>
+              <w:right w:w="200" w:type="dxa"/>
+            </w:tcMar>
+          </w:tcPr>
+          <w:p>
+            <w:pPr>
+              <w:spacing w:before="0" w:after="80"/>
+            </w:pPr>
+            <w:r>
+              <w:rPr>
+                <w:rFonts w:ascii="Verdana" w:hAnsi="Verdana"/>
+                <w:b/>
+                <w:color w:val="0F172A"/>
+                <w:sz w:val="21"/>
+              </w:rPr>
+              <w:t>Concedente</w:t>
+            </w:r>
+          </w:p>
+          <w:p>
+            <w:pPr>
+              <w:spacing w:before="80" w:after="80" w:line="276" w:lineRule="auto"/>
+            </w:pPr>
+            <w:r>
+              <w:rPr>
+                <w:rFonts w:ascii="Verdana" w:hAnsi="Verdana"/>
+                <w:color w:val="3C3C3C"/>
+                <w:sz w:val="20"/>
+              </w:rPr>
+              <w:t>Órgão ou entidade da Administração Pública Federal responsável pela destinação do recurso e supervisão técnica.</w:t>
+            </w:r>
+          </w:p>
+        </w:tc>
+      </w:tr>
+    </w:tbl>
+    <w:p>
+      <w:pPr>
+        <w:spacing w:before="120" w:after="120"/>
+      </w:pPr>
+    </w:p>
+    <w:tbl>
+      <w:tblPr>
+        <w:tblW w:type="auto" w:w="0"/>
+        <w:jc w:val="center"/>
+        <w:tblLayout w:type="fixed"/>
+        <w:tblLook w:firstColumn="1" w:firstRow="1" w:lastColumn="0" w:lastRow="0" w:noHBand="0" w:noVBand="1" w:val="04A0"/>
+      </w:tblPr>
+      <w:tblGrid>
+        <w:gridCol w:w="9360"/>
+      </w:tblGrid>
+      <w:tr>
+        <w:tc>
+          <w:tcPr>
+            <w:tcW w:type="dxa" w:w="8352"/>
+            <w:shd w:val="clear" w:color="auto" w:fill="F8FAFC"/>
+            <w:tcBorders>
+              <w:left w:val="single" w:sz="36" w:space="0" w:color="2670E8"/>
+              <w:top w:val="none"/>
+              <w:bottom w:val="none"/>
+              <w:right w:val="none"/>
+            </w:tcBorders>
+            <w:tcMar>
+              <w:top w:w="150" w:type="dxa"/>
+              <w:bottom w:w="150" w:type="dxa"/>
+              <w:left w:w="250" w:type="dxa"/>
+              <w:right w:w="200" w:type="dxa"/>
+            </w:tcMar>
+          </w:tcPr>
+          <w:p>
+            <w:pPr>
+              <w:spacing w:before="0" w:after="80"/>
+            </w:pPr>
+            <w:r>
+              <w:rPr>
+                <w:rFonts w:ascii="Verdana" w:hAnsi="Verdana"/>
+                <w:b/>
+                <w:color w:val="0F172A"/>
+                <w:sz w:val="21"/>
+              </w:rPr>
+              <w:t>Proponente</w:t>
+            </w:r>
+          </w:p>
+          <w:p>
+            <w:pPr>
+              <w:spacing w:before="80" w:after="80" w:line="276" w:lineRule="auto"/>
+            </w:pPr>
+            <w:r>
+              <w:rPr>
+                <w:rFonts w:ascii="Verdana" w:hAnsi="Verdana"/>
+                <w:color w:val="3C3C3C"/>
+                <w:sz w:val="20"/>
+              </w:rPr>
+              <w:t>Ente subnacional (Estado ou Município) ou OSC que manifesta interesse no edital e executa as metas pactuadas.</w:t>
+            </w:r>
+          </w:p>
+        </w:tc>
+      </w:tr>
+    </w:tbl>
+    <w:p>
+      <w:pPr>
+        <w:spacing w:before="120" w:after="120"/>
+      </w:pPr>
+    </w:p>
+    <w:p>
+      <w:r>
+        <w:br w:type="page"/>
+      </w:r>
+    </w:p>
+    <w:p>
+      <w:pPr>
+        <w:spacing w:before="2400"/>
+        <w:jc w:val="center"/>
+      </w:pPr>
+      <w:r>
+        <w:rPr>
+          <w:rFonts w:ascii="Verdana" w:hAnsi="Verdana"/>
+          <w:color w:val="475569"/>
+          <w:sz w:val="21"/>
+        </w:rPr>
+        <w:t>Secretaria de Gestão e Inovação (SEGES)</w:t>
+        <w:br/>
+        <w:t>Ministério da Gestão e da Inovação em Serviços Públicos</w:t>
+        <w:br/>
+        <w:br/>
+        <w:t>Canais de Suporte:</w:t>
+        <w:br/>
+        <w:t>Portal Transferegov: www.gov.br/transferegov</w:t>
+        <w:br/>
+        <w:t>Email: suporte.transferegov@gestao.gov.br</w:t>
+      </w:r>
     </w:p>
     <w:sectPr>
       <w:pgSz w:w="12240" w:h="15840"/>

</xml_diff>

<commit_message>
fix: remove technical and design references from Cartilha expediente
</commit_message>
<xml_diff>
--- a/landing_transferegov/materiais_complementares/slides/Cartilha_de_Nivelamento_Modulo_de_Gestao_de_Parcerias_e_TRANSFEREGOV.docx
+++ b/landing_transferegov/materiais_complementares/slides/Cartilha_de_Nivelamento_Modulo_de_Gestao_de_Parcerias_e_TRANSFEREGOV.docx
@@ -93,32 +93,6 @@
           <w:sz w:val="21"/>
         </w:rPr>
         <w:t>Coordenação Geral: Diretoria de Parcerias e Transferências - DTPAR/SEGES/MGI</w:t>
-      </w:r>
-    </w:p>
-    <w:p>
-      <w:pPr>
-        <w:spacing w:after="160" w:line="276" w:lineRule="auto"/>
-      </w:pPr>
-      <w:r>
-        <w:rPr>
-          <w:rFonts w:ascii="Verdana" w:hAnsi="Verdana"/>
-          <w:color w:val="334155"/>
-          <w:sz w:val="21"/>
-        </w:rPr>
-        <w:t>Desenvolvimento Técnico: Equipe de Capacitação da Rede de Parcerias</w:t>
-      </w:r>
-    </w:p>
-    <w:p>
-      <w:pPr>
-        <w:spacing w:after="160" w:line="276" w:lineRule="auto"/>
-      </w:pPr>
-      <w:r>
-        <w:rPr>
-          <w:rFonts w:ascii="Verdana" w:hAnsi="Verdana"/>
-          <w:color w:val="334155"/>
-          <w:sz w:val="21"/>
-        </w:rPr>
-        <w:t>Design e Acessibilidade: Diretoria de Tecnologia e Informações Operacionais</w:t>
       </w:r>
     </w:p>
     <w:p>

</xml_diff>